<commit_message>
update: se actualizaron los notebooks y se agregaron agents memory y skills
</commit_message>
<xml_diff>
--- a/proyecto-integradorV3/06-Documentacion/Informe_Tecnico_Final_AndinaLog_03B.docx
+++ b/proyecto-integradorV3/06-Documentacion/Informe_Tecnico_Final_AndinaLog_03B.docx
@@ -83,7 +83,7 @@
     </w:p>
     <w:tbl>
       <w:tblPr>
-        <w:tblW w:w="10512" w:type="dxa"/>
+        <w:tblW w:w="9887" w:type="dxa"/>
         <w:jc w:val="center"/>
         <w:tblBorders>
           <w:top w:val="single" w:sz="8" w:space="0" w:color="D9D9D9"/>
@@ -97,8 +97,8 @@
         <w:tblLook w:val="04A0" w:firstRow="1" w:lastRow="0" w:firstColumn="1" w:lastColumn="0" w:noHBand="0" w:noVBand="1"/>
       </w:tblPr>
       <w:tblGrid>
-        <w:gridCol w:w="4803"/>
-        <w:gridCol w:w="5709"/>
+        <w:gridCol w:w="2520"/>
+        <w:gridCol w:w="7367"/>
       </w:tblGrid>
       <w:tr>
         <w:trPr>
@@ -107,7 +107,7 @@
         </w:trPr>
         <w:tc>
           <w:tcPr>
-            <w:tcW w:w="4803" w:type="dxa"/>
+            <w:tcW w:w="2520" w:type="dxa"/>
             <w:shd w:val="clear" w:color="auto" w:fill="1F4E78"/>
             <w:tcMar>
               <w:top w:w="90" w:type="dxa"/>
@@ -140,7 +140,7 @@
         </w:tc>
         <w:tc>
           <w:tcPr>
-            <w:tcW w:w="5709" w:type="dxa"/>
+            <w:tcW w:w="7367" w:type="dxa"/>
             <w:shd w:val="clear" w:color="auto" w:fill="1F4E78"/>
             <w:tcMar>
               <w:top w:w="90" w:type="dxa"/>
@@ -178,7 +178,7 @@
         </w:trPr>
         <w:tc>
           <w:tcPr>
-            <w:tcW w:w="4803" w:type="dxa"/>
+            <w:tcW w:w="2520" w:type="dxa"/>
             <w:tcMar>
               <w:top w:w="90" w:type="dxa"/>
               <w:left w:w="100" w:type="dxa"/>
@@ -208,7 +208,7 @@
         </w:tc>
         <w:tc>
           <w:tcPr>
-            <w:tcW w:w="5709" w:type="dxa"/>
+            <w:tcW w:w="7367" w:type="dxa"/>
             <w:tcMar>
               <w:top w:w="90" w:type="dxa"/>
               <w:left w:w="100" w:type="dxa"/>
@@ -243,7 +243,7 @@
         </w:trPr>
         <w:tc>
           <w:tcPr>
-            <w:tcW w:w="4803" w:type="dxa"/>
+            <w:tcW w:w="2520" w:type="dxa"/>
             <w:shd w:val="clear" w:color="auto" w:fill="EAF2F8"/>
             <w:tcMar>
               <w:top w:w="90" w:type="dxa"/>
@@ -276,7 +276,7 @@
         </w:tc>
         <w:tc>
           <w:tcPr>
-            <w:tcW w:w="5709" w:type="dxa"/>
+            <w:tcW w:w="7367" w:type="dxa"/>
             <w:shd w:val="clear" w:color="auto" w:fill="EAF2F8"/>
             <w:tcMar>
               <w:top w:w="90" w:type="dxa"/>
@@ -330,7 +330,7 @@
         </w:trPr>
         <w:tc>
           <w:tcPr>
-            <w:tcW w:w="4803" w:type="dxa"/>
+            <w:tcW w:w="2520" w:type="dxa"/>
             <w:tcMar>
               <w:top w:w="90" w:type="dxa"/>
               <w:left w:w="100" w:type="dxa"/>
@@ -360,7 +360,7 @@
         </w:tc>
         <w:tc>
           <w:tcPr>
-            <w:tcW w:w="5709" w:type="dxa"/>
+            <w:tcW w:w="7367" w:type="dxa"/>
             <w:tcMar>
               <w:top w:w="90" w:type="dxa"/>
               <w:left w:w="100" w:type="dxa"/>
@@ -467,7 +467,7 @@
         </w:trPr>
         <w:tc>
           <w:tcPr>
-            <w:tcW w:w="4803" w:type="dxa"/>
+            <w:tcW w:w="2520" w:type="dxa"/>
             <w:shd w:val="clear" w:color="auto" w:fill="EAF2F8"/>
             <w:tcMar>
               <w:top w:w="90" w:type="dxa"/>
@@ -498,7 +498,7 @@
         </w:tc>
         <w:tc>
           <w:tcPr>
-            <w:tcW w:w="5709" w:type="dxa"/>
+            <w:tcW w:w="7367" w:type="dxa"/>
             <w:shd w:val="clear" w:color="auto" w:fill="EAF2F8"/>
             <w:tcMar>
               <w:top w:w="90" w:type="dxa"/>
@@ -523,7 +523,7 @@
                 <w:szCs w:val="18"/>
                 <w:lang w:val="es-US"/>
               </w:rPr>
-              <w:t>28/09/2026 Versión 1.0</w:t>
+              <w:t>30/09/2026 Versión 1.1</w:t>
             </w:r>
           </w:p>
         </w:tc>
@@ -534,7 +534,7 @@
         </w:trPr>
         <w:tc>
           <w:tcPr>
-            <w:tcW w:w="4803" w:type="dxa"/>
+            <w:tcW w:w="2520" w:type="dxa"/>
             <w:tcMar>
               <w:top w:w="90" w:type="dxa"/>
               <w:left w:w="100" w:type="dxa"/>
@@ -564,7 +564,7 @@
         </w:tc>
         <w:tc>
           <w:tcPr>
-            <w:tcW w:w="5709" w:type="dxa"/>
+            <w:tcW w:w="7367" w:type="dxa"/>
             <w:tcMar>
               <w:top w:w="90" w:type="dxa"/>
               <w:left w:w="100" w:type="dxa"/>
@@ -626,13 +626,13 @@
         <w:rPr>
           <w:lang w:val="es-US"/>
         </w:rPr>
-        <w:t>.</w:t>
+        <w:t xml:space="preserve">. </w:t>
       </w:r>
       <w:r>
         <w:rPr>
           <w:lang w:val="es-US"/>
         </w:rPr>
-        <w:t xml:space="preserve"> Problema y valor industrial</w:t>
+        <w:t>Problema y valor industrial</w:t>
       </w:r>
     </w:p>
     <w:p>
@@ -724,7 +724,6 @@
     </w:p>
     <w:p>
       <w:pPr>
-        <w:spacing w:before="60"/>
         <w:rPr>
           <w:sz w:val="18"/>
           <w:szCs w:val="18"/>
@@ -761,7 +760,7 @@
         <w:gridCol w:w="1800"/>
         <w:gridCol w:w="2232"/>
         <w:gridCol w:w="1584"/>
-        <w:gridCol w:w="4007"/>
+        <w:gridCol w:w="4149"/>
       </w:tblGrid>
       <w:tr>
         <w:trPr>
@@ -869,7 +868,7 @@
         </w:tc>
         <w:tc>
           <w:tcPr>
-            <w:tcW w:w="4007" w:type="dxa"/>
+            <w:tcW w:w="4149" w:type="dxa"/>
             <w:shd w:val="clear" w:color="auto" w:fill="1F4E78"/>
             <w:tcMar>
               <w:top w:w="90" w:type="dxa"/>
@@ -1007,7 +1006,7 @@
         </w:tc>
         <w:tc>
           <w:tcPr>
-            <w:tcW w:w="4007" w:type="dxa"/>
+            <w:tcW w:w="4149" w:type="dxa"/>
             <w:tcMar>
               <w:top w:w="90" w:type="dxa"/>
               <w:left w:w="100" w:type="dxa"/>
@@ -1145,7 +1144,7 @@
         </w:tc>
         <w:tc>
           <w:tcPr>
-            <w:tcW w:w="4007" w:type="dxa"/>
+            <w:tcW w:w="4149" w:type="dxa"/>
             <w:shd w:val="clear" w:color="auto" w:fill="EAF2F8"/>
             <w:tcMar>
               <w:top w:w="90" w:type="dxa"/>
@@ -1281,7 +1280,7 @@
         </w:tc>
         <w:tc>
           <w:tcPr>
-            <w:tcW w:w="4007" w:type="dxa"/>
+            <w:tcW w:w="4149" w:type="dxa"/>
             <w:tcMar>
               <w:top w:w="90" w:type="dxa"/>
               <w:left w:w="100" w:type="dxa"/>
@@ -1390,13 +1389,13 @@
         <w:rPr>
           <w:lang w:val="es-US"/>
         </w:rPr>
-        <w:t>.</w:t>
+        <w:t xml:space="preserve">. </w:t>
       </w:r>
       <w:r>
         <w:rPr>
           <w:lang w:val="es-US"/>
         </w:rPr>
-        <w:t xml:space="preserve"> Análisis exploratorio</w:t>
+        <w:t>Análisis exploratorio</w:t>
       </w:r>
     </w:p>
     <w:p>
@@ -1435,7 +1434,19 @@
         <w:rPr>
           <w:lang w:val="es-US"/>
         </w:rPr>
-        <w:t>Figura 1 Frecuencia del objetivo futuro</w:t>
+        <w:t>Figura 1</w:t>
+      </w:r>
+      <w:r>
+        <w:rPr>
+          <w:lang w:val="es-US"/>
+        </w:rPr>
+        <w:t>:</w:t>
+      </w:r>
+      <w:r>
+        <w:rPr>
+          <w:lang w:val="es-US"/>
+        </w:rPr>
+        <w:t xml:space="preserve"> Frecuencia del objetivo futuro</w:t>
       </w:r>
     </w:p>
     <w:p>
@@ -1452,7 +1463,7 @@
           <w:lang w:val="es-US"/>
         </w:rPr>
         <w:drawing>
-          <wp:inline distT="0" distB="0" distL="0" distR="0" wp14:anchorId="5CB8ABA6" wp14:editId="339DDC24">
+          <wp:inline distT="0" distB="0" distL="0" distR="0" wp14:anchorId="21D9DFDA" wp14:editId="3E6D61D2">
             <wp:extent cx="4937760" cy="2350700"/>
             <wp:effectExtent l="0" t="0" r="0" b="0"/>
             <wp:docPr id="1" name="Picture 1" descr="Gráfico de barras con 24 501 casos negativos y 1 296 positivos"/>
@@ -1491,15 +1502,6 @@
     <w:p>
       <w:pPr>
         <w:spacing w:after="80" w:line="252" w:lineRule="auto"/>
-        <w:jc w:val="center"/>
-        <w:rPr>
-          <w:lang w:val="es-US"/>
-        </w:rPr>
-      </w:pPr>
-    </w:p>
-    <w:p>
-      <w:pPr>
-        <w:spacing w:after="80" w:line="252" w:lineRule="auto"/>
         <w:jc w:val="both"/>
         <w:rPr>
           <w:lang w:val="es-US"/>
@@ -1523,9 +1525,17 @@
       </w:r>
       <w:r>
         <w:rPr>
-          <w:lang w:val="es-US"/>
-        </w:rPr>
-        <w:t xml:space="preserve"> Solo 1296 lecturas, equivalentes al 5,02</w:t>
+          <w:b/>
+          <w:bCs/>
+          <w:lang w:val="es-US"/>
+        </w:rPr>
+        <w:t xml:space="preserve"> </w:t>
+      </w:r>
+      <w:r>
+        <w:rPr>
+          <w:lang w:val="es-US"/>
+        </w:rPr>
+        <w:t>Solo 1296 lecturas, equivalentes al 5,02</w:t>
       </w:r>
       <w:r>
         <w:rPr>
@@ -1561,7 +1571,19 @@
         <w:rPr>
           <w:lang w:val="es-US"/>
         </w:rPr>
-        <w:t>Figura 2 Desviación actual y frecuencia futura</w:t>
+        <w:t>Figura 2</w:t>
+      </w:r>
+      <w:r>
+        <w:rPr>
+          <w:lang w:val="es-US"/>
+        </w:rPr>
+        <w:t xml:space="preserve">: </w:t>
+      </w:r>
+      <w:r>
+        <w:rPr>
+          <w:lang w:val="es-US"/>
+        </w:rPr>
+        <w:t>Desviación actual y frecuencia futura</w:t>
       </w:r>
     </w:p>
     <w:p>
@@ -1578,7 +1600,7 @@
           <w:lang w:val="es-US"/>
         </w:rPr>
         <w:drawing>
-          <wp:inline distT="0" distB="0" distL="0" distR="0" wp14:anchorId="4A132CF1" wp14:editId="5CAFE78D">
+          <wp:inline distT="0" distB="0" distL="0" distR="0" wp14:anchorId="054E94E7" wp14:editId="32B30CB4">
             <wp:extent cx="4937760" cy="2358912"/>
             <wp:effectExtent l="0" t="0" r="0" b="0"/>
             <wp:docPr id="2" name="Picture 2" descr="Comparación de la frecuencia futura según exista o no una desviación actual"/>
@@ -1648,13 +1670,25 @@
         <w:rPr>
           <w:lang w:val="es-US"/>
         </w:rPr>
+        <w:t xml:space="preserve">% </w:t>
+      </w:r>
+      <w:r>
+        <w:rPr>
+          <w:lang w:val="es-US"/>
+        </w:rPr>
+        <w:t xml:space="preserve">sin desviación actual y 59,41 </w:t>
+      </w:r>
+      <w:r>
+        <w:rPr>
+          <w:lang w:val="es-US"/>
+        </w:rPr>
         <w:t>%</w:t>
       </w:r>
       <w:r>
         <w:rPr>
           <w:lang w:val="es-US"/>
         </w:rPr>
-        <w:t xml:space="preserve"> sin desviación actual y 59,41</w:t>
+        <w:t xml:space="preserve"> cuando la desviación ya está presente. Además, el grupo con evento futuro presenta temperatura mediana de 5,24 grados Celsius y humedad mediana de 72,40</w:t>
       </w:r>
       <w:r>
         <w:rPr>
@@ -1666,7 +1700,653 @@
         <w:rPr>
           <w:lang w:val="es-US"/>
         </w:rPr>
-        <w:t xml:space="preserve"> cuando la desviación ya está presente. Además, el grupo con evento futuro presenta temperatura mediana de 5,24 grados Celsius y humedad mediana de 72,40</w:t>
+        <w:t>. Esta comparación general debe leerse con precaución porque mezcla productos con distintas condiciones térmicas.</w:t>
+      </w:r>
+    </w:p>
+    <w:p>
+      <w:pPr>
+        <w:pStyle w:val="Heading2"/>
+        <w:rPr>
+          <w:lang w:val="es-US"/>
+        </w:rPr>
+      </w:pPr>
+      <w:r>
+        <w:rPr>
+          <w:lang w:val="es-US"/>
+        </w:rPr>
+        <w:t>Temperatura y riesgo por producto</w:t>
+      </w:r>
+    </w:p>
+    <w:p>
+      <w:pPr>
+        <w:spacing w:after="80" w:line="252" w:lineRule="auto"/>
+        <w:jc w:val="both"/>
+        <w:rPr>
+          <w:lang w:val="es-US"/>
+        </w:rPr>
+      </w:pPr>
+      <w:r>
+        <w:rPr>
+          <w:lang w:val="es-US"/>
+        </w:rPr>
+        <w:t>La segmentación por producto confirma que no todas las cargas trabajan alrededor de la misma temperatura. En los datos aparecen 10 productos con mediana cercana a -17,96 grados Celsius, 20 productos alrededor de 4,04 grados Celsius y 30 productos alrededor de 20,03 grados Celsius. Estos valores son grupos observados, no rangos permitidos: la fuente no contiene una tabla oficial con los límites térmicos de cada producto.</w:t>
+      </w:r>
+    </w:p>
+    <w:p>
+      <w:pPr>
+        <w:pStyle w:val="Caption"/>
+        <w:keepNext/>
+        <w:rPr>
+          <w:lang w:val="es-US"/>
+        </w:rPr>
+      </w:pPr>
+      <w:r>
+        <w:rPr>
+          <w:lang w:val="es-US"/>
+        </w:rPr>
+        <w:lastRenderedPageBreak/>
+        <w:t>Figura 3</w:t>
+      </w:r>
+      <w:r>
+        <w:rPr>
+          <w:lang w:val="es-US"/>
+        </w:rPr>
+        <w:t xml:space="preserve">: </w:t>
+      </w:r>
+      <w:r>
+        <w:rPr>
+          <w:lang w:val="es-US"/>
+        </w:rPr>
+        <w:t>Temperatura y riesgo futuro por grupo térmico observado</w:t>
+      </w:r>
+    </w:p>
+    <w:p>
+      <w:pPr>
+        <w:spacing w:after="80" w:line="252" w:lineRule="auto"/>
+        <w:jc w:val="center"/>
+        <w:rPr>
+          <w:lang w:val="es-US"/>
+        </w:rPr>
+      </w:pPr>
+      <w:r>
+        <w:rPr>
+          <w:noProof/>
+          <w:lang w:val="es-US"/>
+        </w:rPr>
+        <w:drawing>
+          <wp:inline distT="0" distB="0" distL="0" distR="0" wp14:anchorId="19FB245E" wp14:editId="52AEEEDB">
+            <wp:extent cx="6035040" cy="2443251"/>
+            <wp:effectExtent l="0" t="0" r="0" b="0"/>
+            <wp:docPr id="3" name="Picture 3" descr="Comparación de temperatura mediana y desviación futura en tres grupos térmicos observados"/>
+            <wp:cNvGraphicFramePr>
+              <a:graphicFrameLocks xmlns:a="http://schemas.openxmlformats.org/drawingml/2006/main" noChangeAspect="1"/>
+            </wp:cNvGraphicFramePr>
+            <a:graphic xmlns:a="http://schemas.openxmlformats.org/drawingml/2006/main">
+              <a:graphicData uri="http://schemas.openxmlformats.org/drawingml/2006/picture">
+                <pic:pic xmlns:pic="http://schemas.openxmlformats.org/drawingml/2006/picture">
+                  <pic:nvPicPr>
+                    <pic:cNvPr id="0" name="figura_producto_grupos.png"/>
+                    <pic:cNvPicPr/>
+                  </pic:nvPicPr>
+                  <pic:blipFill>
+                    <a:blip r:embed="rId10"/>
+                    <a:stretch>
+                      <a:fillRect/>
+                    </a:stretch>
+                  </pic:blipFill>
+                  <pic:spPr>
+                    <a:xfrm>
+                      <a:off x="0" y="0"/>
+                      <a:ext cx="6035040" cy="2443251"/>
+                    </a:xfrm>
+                    <a:prstGeom prst="rect">
+                      <a:avLst/>
+                    </a:prstGeom>
+                  </pic:spPr>
+                </pic:pic>
+              </a:graphicData>
+            </a:graphic>
+          </wp:inline>
+        </w:drawing>
+      </w:r>
+    </w:p>
+    <w:p>
+      <w:pPr>
+        <w:spacing w:after="80" w:line="252" w:lineRule="auto"/>
+        <w:rPr>
+          <w:lang w:val="es-US"/>
+        </w:rPr>
+      </w:pPr>
+    </w:p>
+    <w:tbl>
+      <w:tblPr>
+        <w:tblW w:w="0" w:type="auto"/>
+        <w:jc w:val="center"/>
+        <w:tblBorders>
+          <w:top w:val="single" w:sz="8" w:space="0" w:color="D9D9D9"/>
+          <w:left w:val="single" w:sz="8" w:space="0" w:color="D9D9D9"/>
+          <w:bottom w:val="single" w:sz="8" w:space="0" w:color="D9D9D9"/>
+          <w:right w:val="single" w:sz="8" w:space="0" w:color="D9D9D9"/>
+          <w:insideH w:val="single" w:sz="8" w:space="0" w:color="D9D9D9"/>
+          <w:insideV w:val="single" w:sz="8" w:space="0" w:color="D9D9D9"/>
+        </w:tblBorders>
+        <w:tblLayout w:type="fixed"/>
+        <w:tblLook w:val="04A0" w:firstRow="1" w:lastRow="0" w:firstColumn="1" w:lastColumn="0" w:noHBand="0" w:noVBand="1"/>
+      </w:tblPr>
+      <w:tblGrid>
+        <w:gridCol w:w="3168"/>
+        <w:gridCol w:w="1584"/>
+        <w:gridCol w:w="2736"/>
+        <w:gridCol w:w="2416"/>
+      </w:tblGrid>
+      <w:tr>
+        <w:trPr>
+          <w:tblHeader/>
+          <w:jc w:val="center"/>
+        </w:trPr>
+        <w:tc>
+          <w:tcPr>
+            <w:tcW w:w="3168" w:type="dxa"/>
+            <w:shd w:val="clear" w:color="auto" w:fill="1F4E78"/>
+            <w:tcMar>
+              <w:top w:w="90" w:type="dxa"/>
+              <w:left w:w="100" w:type="dxa"/>
+              <w:bottom w:w="90" w:type="dxa"/>
+              <w:right w:w="100" w:type="dxa"/>
+            </w:tcMar>
+            <w:vAlign w:val="center"/>
+          </w:tcPr>
+          <w:p>
+            <w:pPr>
+              <w:spacing w:after="0"/>
+              <w:rPr>
+                <w:lang w:val="es-US"/>
+              </w:rPr>
+            </w:pPr>
+            <w:r>
+              <w:rPr>
+                <w:b/>
+                <w:color w:val="FFFFFF"/>
+                <w:sz w:val="17"/>
+                <w:lang w:val="es-US"/>
+              </w:rPr>
+              <w:t>Grupo observado</w:t>
+            </w:r>
+          </w:p>
+        </w:tc>
+        <w:tc>
+          <w:tcPr>
+            <w:tcW w:w="1584" w:type="dxa"/>
+            <w:shd w:val="clear" w:color="auto" w:fill="1F4E78"/>
+            <w:tcMar>
+              <w:top w:w="90" w:type="dxa"/>
+              <w:left w:w="100" w:type="dxa"/>
+              <w:bottom w:w="90" w:type="dxa"/>
+              <w:right w:w="100" w:type="dxa"/>
+            </w:tcMar>
+            <w:vAlign w:val="center"/>
+          </w:tcPr>
+          <w:p>
+            <w:pPr>
+              <w:spacing w:after="0"/>
+              <w:rPr>
+                <w:lang w:val="es-US"/>
+              </w:rPr>
+            </w:pPr>
+            <w:r>
+              <w:rPr>
+                <w:b/>
+                <w:color w:val="FFFFFF"/>
+                <w:sz w:val="17"/>
+                <w:lang w:val="es-US"/>
+              </w:rPr>
+              <w:t>Productos</w:t>
+            </w:r>
+          </w:p>
+        </w:tc>
+        <w:tc>
+          <w:tcPr>
+            <w:tcW w:w="2736" w:type="dxa"/>
+            <w:shd w:val="clear" w:color="auto" w:fill="1F4E78"/>
+            <w:tcMar>
+              <w:top w:w="90" w:type="dxa"/>
+              <w:left w:w="100" w:type="dxa"/>
+              <w:bottom w:w="90" w:type="dxa"/>
+              <w:right w:w="100" w:type="dxa"/>
+            </w:tcMar>
+            <w:vAlign w:val="center"/>
+          </w:tcPr>
+          <w:p>
+            <w:pPr>
+              <w:spacing w:after="0"/>
+              <w:rPr>
+                <w:lang w:val="es-US"/>
+              </w:rPr>
+            </w:pPr>
+            <w:r>
+              <w:rPr>
+                <w:b/>
+                <w:color w:val="FFFFFF"/>
+                <w:sz w:val="17"/>
+                <w:lang w:val="es-US"/>
+              </w:rPr>
+              <w:t>Temperatura mediana</w:t>
+            </w:r>
+          </w:p>
+        </w:tc>
+        <w:tc>
+          <w:tcPr>
+            <w:tcW w:w="2416" w:type="dxa"/>
+            <w:shd w:val="clear" w:color="auto" w:fill="1F4E78"/>
+            <w:tcMar>
+              <w:top w:w="90" w:type="dxa"/>
+              <w:left w:w="100" w:type="dxa"/>
+              <w:bottom w:w="90" w:type="dxa"/>
+              <w:right w:w="100" w:type="dxa"/>
+            </w:tcMar>
+            <w:vAlign w:val="center"/>
+          </w:tcPr>
+          <w:p>
+            <w:pPr>
+              <w:spacing w:after="0"/>
+              <w:rPr>
+                <w:lang w:val="es-US"/>
+              </w:rPr>
+            </w:pPr>
+            <w:r>
+              <w:rPr>
+                <w:b/>
+                <w:color w:val="FFFFFF"/>
+                <w:sz w:val="17"/>
+                <w:lang w:val="es-US"/>
+              </w:rPr>
+              <w:t>Desviación futura</w:t>
+            </w:r>
+          </w:p>
+        </w:tc>
+      </w:tr>
+      <w:tr>
+        <w:trPr>
+          <w:jc w:val="center"/>
+        </w:trPr>
+        <w:tc>
+          <w:tcPr>
+            <w:tcW w:w="3168" w:type="dxa"/>
+            <w:tcMar>
+              <w:top w:w="90" w:type="dxa"/>
+              <w:left w:w="100" w:type="dxa"/>
+              <w:bottom w:w="90" w:type="dxa"/>
+              <w:right w:w="100" w:type="dxa"/>
+            </w:tcMar>
+            <w:vAlign w:val="center"/>
+          </w:tcPr>
+          <w:p>
+            <w:pPr>
+              <w:spacing w:after="0"/>
+              <w:rPr>
+                <w:lang w:val="es-US"/>
+              </w:rPr>
+            </w:pPr>
+            <w:r>
+              <w:rPr>
+                <w:sz w:val="17"/>
+                <w:lang w:val="es-US"/>
+              </w:rPr>
+              <w:t>Menor a 0 °C</w:t>
+            </w:r>
+          </w:p>
+        </w:tc>
+        <w:tc>
+          <w:tcPr>
+            <w:tcW w:w="1584" w:type="dxa"/>
+            <w:tcMar>
+              <w:top w:w="90" w:type="dxa"/>
+              <w:left w:w="100" w:type="dxa"/>
+              <w:bottom w:w="90" w:type="dxa"/>
+              <w:right w:w="100" w:type="dxa"/>
+            </w:tcMar>
+            <w:vAlign w:val="center"/>
+          </w:tcPr>
+          <w:p>
+            <w:pPr>
+              <w:spacing w:after="0"/>
+              <w:rPr>
+                <w:lang w:val="es-US"/>
+              </w:rPr>
+            </w:pPr>
+            <w:r>
+              <w:rPr>
+                <w:sz w:val="17"/>
+                <w:lang w:val="es-US"/>
+              </w:rPr>
+              <w:t>10</w:t>
+            </w:r>
+          </w:p>
+        </w:tc>
+        <w:tc>
+          <w:tcPr>
+            <w:tcW w:w="2736" w:type="dxa"/>
+            <w:tcMar>
+              <w:top w:w="90" w:type="dxa"/>
+              <w:left w:w="100" w:type="dxa"/>
+              <w:bottom w:w="90" w:type="dxa"/>
+              <w:right w:w="100" w:type="dxa"/>
+            </w:tcMar>
+            <w:vAlign w:val="center"/>
+          </w:tcPr>
+          <w:p>
+            <w:pPr>
+              <w:spacing w:after="0"/>
+              <w:rPr>
+                <w:lang w:val="es-US"/>
+              </w:rPr>
+            </w:pPr>
+            <w:r>
+              <w:rPr>
+                <w:sz w:val="17"/>
+                <w:lang w:val="es-US"/>
+              </w:rPr>
+              <w:t>-17,96 °C</w:t>
+            </w:r>
+          </w:p>
+        </w:tc>
+        <w:tc>
+          <w:tcPr>
+            <w:tcW w:w="2416" w:type="dxa"/>
+            <w:tcMar>
+              <w:top w:w="90" w:type="dxa"/>
+              <w:left w:w="100" w:type="dxa"/>
+              <w:bottom w:w="90" w:type="dxa"/>
+              <w:right w:w="100" w:type="dxa"/>
+            </w:tcMar>
+            <w:vAlign w:val="center"/>
+          </w:tcPr>
+          <w:p>
+            <w:pPr>
+              <w:spacing w:after="0"/>
+              <w:rPr>
+                <w:lang w:val="es-US"/>
+              </w:rPr>
+            </w:pPr>
+            <w:r>
+              <w:rPr>
+                <w:sz w:val="17"/>
+                <w:lang w:val="es-US"/>
+              </w:rPr>
+              <w:t>7,44 %</w:t>
+            </w:r>
+          </w:p>
+        </w:tc>
+      </w:tr>
+      <w:tr>
+        <w:trPr>
+          <w:jc w:val="center"/>
+        </w:trPr>
+        <w:tc>
+          <w:tcPr>
+            <w:tcW w:w="3168" w:type="dxa"/>
+            <w:shd w:val="clear" w:color="auto" w:fill="EAF2F8"/>
+            <w:tcMar>
+              <w:top w:w="90" w:type="dxa"/>
+              <w:left w:w="100" w:type="dxa"/>
+              <w:bottom w:w="90" w:type="dxa"/>
+              <w:right w:w="100" w:type="dxa"/>
+            </w:tcMar>
+            <w:vAlign w:val="center"/>
+          </w:tcPr>
+          <w:p>
+            <w:pPr>
+              <w:spacing w:after="0"/>
+              <w:rPr>
+                <w:lang w:val="es-US"/>
+              </w:rPr>
+            </w:pPr>
+            <w:r>
+              <w:rPr>
+                <w:sz w:val="17"/>
+                <w:lang w:val="es-US"/>
+              </w:rPr>
+              <w:t>Entre 0 y 10 °C</w:t>
+            </w:r>
+          </w:p>
+        </w:tc>
+        <w:tc>
+          <w:tcPr>
+            <w:tcW w:w="1584" w:type="dxa"/>
+            <w:shd w:val="clear" w:color="auto" w:fill="EAF2F8"/>
+            <w:tcMar>
+              <w:top w:w="90" w:type="dxa"/>
+              <w:left w:w="100" w:type="dxa"/>
+              <w:bottom w:w="90" w:type="dxa"/>
+              <w:right w:w="100" w:type="dxa"/>
+            </w:tcMar>
+            <w:vAlign w:val="center"/>
+          </w:tcPr>
+          <w:p>
+            <w:pPr>
+              <w:spacing w:after="0"/>
+              <w:rPr>
+                <w:lang w:val="es-US"/>
+              </w:rPr>
+            </w:pPr>
+            <w:r>
+              <w:rPr>
+                <w:sz w:val="17"/>
+                <w:lang w:val="es-US"/>
+              </w:rPr>
+              <w:t>20</w:t>
+            </w:r>
+          </w:p>
+        </w:tc>
+        <w:tc>
+          <w:tcPr>
+            <w:tcW w:w="2736" w:type="dxa"/>
+            <w:shd w:val="clear" w:color="auto" w:fill="EAF2F8"/>
+            <w:tcMar>
+              <w:top w:w="90" w:type="dxa"/>
+              <w:left w:w="100" w:type="dxa"/>
+              <w:bottom w:w="90" w:type="dxa"/>
+              <w:right w:w="100" w:type="dxa"/>
+            </w:tcMar>
+            <w:vAlign w:val="center"/>
+          </w:tcPr>
+          <w:p>
+            <w:pPr>
+              <w:spacing w:after="0"/>
+              <w:rPr>
+                <w:lang w:val="es-US"/>
+              </w:rPr>
+            </w:pPr>
+            <w:r>
+              <w:rPr>
+                <w:sz w:val="17"/>
+                <w:lang w:val="es-US"/>
+              </w:rPr>
+              <w:t>4,04 °C</w:t>
+            </w:r>
+          </w:p>
+        </w:tc>
+        <w:tc>
+          <w:tcPr>
+            <w:tcW w:w="2416" w:type="dxa"/>
+            <w:shd w:val="clear" w:color="auto" w:fill="EAF2F8"/>
+            <w:tcMar>
+              <w:top w:w="90" w:type="dxa"/>
+              <w:left w:w="100" w:type="dxa"/>
+              <w:bottom w:w="90" w:type="dxa"/>
+              <w:right w:w="100" w:type="dxa"/>
+            </w:tcMar>
+            <w:vAlign w:val="center"/>
+          </w:tcPr>
+          <w:p>
+            <w:pPr>
+              <w:spacing w:after="0"/>
+              <w:rPr>
+                <w:lang w:val="es-US"/>
+              </w:rPr>
+            </w:pPr>
+            <w:r>
+              <w:rPr>
+                <w:sz w:val="17"/>
+                <w:lang w:val="es-US"/>
+              </w:rPr>
+              <w:t>7,85 %</w:t>
+            </w:r>
+          </w:p>
+        </w:tc>
+      </w:tr>
+      <w:tr>
+        <w:trPr>
+          <w:jc w:val="center"/>
+        </w:trPr>
+        <w:tc>
+          <w:tcPr>
+            <w:tcW w:w="3168" w:type="dxa"/>
+            <w:tcMar>
+              <w:top w:w="90" w:type="dxa"/>
+              <w:left w:w="100" w:type="dxa"/>
+              <w:bottom w:w="90" w:type="dxa"/>
+              <w:right w:w="100" w:type="dxa"/>
+            </w:tcMar>
+            <w:vAlign w:val="center"/>
+          </w:tcPr>
+          <w:p>
+            <w:pPr>
+              <w:spacing w:after="0"/>
+              <w:rPr>
+                <w:lang w:val="es-US"/>
+              </w:rPr>
+            </w:pPr>
+            <w:r>
+              <w:rPr>
+                <w:sz w:val="17"/>
+                <w:lang w:val="es-US"/>
+              </w:rPr>
+              <w:t>Mayor o igual a 10 °C</w:t>
+            </w:r>
+          </w:p>
+        </w:tc>
+        <w:tc>
+          <w:tcPr>
+            <w:tcW w:w="1584" w:type="dxa"/>
+            <w:tcMar>
+              <w:top w:w="90" w:type="dxa"/>
+              <w:left w:w="100" w:type="dxa"/>
+              <w:bottom w:w="90" w:type="dxa"/>
+              <w:right w:w="100" w:type="dxa"/>
+            </w:tcMar>
+            <w:vAlign w:val="center"/>
+          </w:tcPr>
+          <w:p>
+            <w:pPr>
+              <w:spacing w:after="0"/>
+              <w:rPr>
+                <w:lang w:val="es-US"/>
+              </w:rPr>
+            </w:pPr>
+            <w:r>
+              <w:rPr>
+                <w:sz w:val="17"/>
+                <w:lang w:val="es-US"/>
+              </w:rPr>
+              <w:t>30</w:t>
+            </w:r>
+          </w:p>
+        </w:tc>
+        <w:tc>
+          <w:tcPr>
+            <w:tcW w:w="2736" w:type="dxa"/>
+            <w:tcMar>
+              <w:top w:w="90" w:type="dxa"/>
+              <w:left w:w="100" w:type="dxa"/>
+              <w:bottom w:w="90" w:type="dxa"/>
+              <w:right w:w="100" w:type="dxa"/>
+            </w:tcMar>
+            <w:vAlign w:val="center"/>
+          </w:tcPr>
+          <w:p>
+            <w:pPr>
+              <w:spacing w:after="0"/>
+              <w:rPr>
+                <w:lang w:val="es-US"/>
+              </w:rPr>
+            </w:pPr>
+            <w:r>
+              <w:rPr>
+                <w:sz w:val="17"/>
+                <w:lang w:val="es-US"/>
+              </w:rPr>
+              <w:t>20,03 °C</w:t>
+            </w:r>
+          </w:p>
+        </w:tc>
+        <w:tc>
+          <w:tcPr>
+            <w:tcW w:w="2416" w:type="dxa"/>
+            <w:tcMar>
+              <w:top w:w="90" w:type="dxa"/>
+              <w:left w:w="100" w:type="dxa"/>
+              <w:bottom w:w="90" w:type="dxa"/>
+              <w:right w:w="100" w:type="dxa"/>
+            </w:tcMar>
+            <w:vAlign w:val="center"/>
+          </w:tcPr>
+          <w:p>
+            <w:pPr>
+              <w:spacing w:after="0"/>
+              <w:rPr>
+                <w:lang w:val="es-US"/>
+              </w:rPr>
+            </w:pPr>
+            <w:r>
+              <w:rPr>
+                <w:sz w:val="17"/>
+                <w:lang w:val="es-US"/>
+              </w:rPr>
+              <w:t>2,39 %</w:t>
+            </w:r>
+          </w:p>
+        </w:tc>
+      </w:tr>
+    </w:tbl>
+    <w:p>
+      <w:pPr>
+        <w:spacing w:after="80" w:line="252" w:lineRule="auto"/>
+        <w:jc w:val="both"/>
+        <w:rPr>
+          <w:lang w:val="es-US"/>
+        </w:rPr>
+      </w:pPr>
+    </w:p>
+    <w:p>
+      <w:pPr>
+        <w:spacing w:after="80" w:line="252" w:lineRule="auto"/>
+        <w:jc w:val="both"/>
+        <w:rPr>
+          <w:lang w:val="es-US"/>
+        </w:rPr>
+      </w:pPr>
+      <w:r>
+        <w:rPr>
+          <w:b/>
+          <w:bCs/>
+          <w:lang w:val="es-US"/>
+        </w:rPr>
+        <w:t>Interpretación</w:t>
+      </w:r>
+      <w:r>
+        <w:rPr>
+          <w:b/>
+          <w:bCs/>
+          <w:lang w:val="es-US"/>
+        </w:rPr>
+        <w:t>:</w:t>
+      </w:r>
+      <w:r>
+        <w:rPr>
+          <w:lang w:val="es-US"/>
+        </w:rPr>
+        <w:t xml:space="preserve"> El riesgo futuro cambia entre productos y grupos térmicos. Los porcentajes más altos por producto aparecen en PROD-047 con 12,41</w:t>
       </w:r>
       <w:r>
         <w:rPr>
@@ -1678,7 +2358,55 @@
         <w:rPr>
           <w:lang w:val="es-US"/>
         </w:rPr>
-        <w:t>.</w:t>
+        <w:t>, PROD-056 con 11,23</w:t>
+      </w:r>
+      <w:r>
+        <w:rPr>
+          <w:lang w:val="es-US"/>
+        </w:rPr>
+        <w:t>%</w:t>
+      </w:r>
+      <w:r>
+        <w:rPr>
+          <w:lang w:val="es-US"/>
+        </w:rPr>
+        <w:t>, PROD-008 con 10,98</w:t>
+      </w:r>
+      <w:r>
+        <w:rPr>
+          <w:lang w:val="es-US"/>
+        </w:rPr>
+        <w:t>%</w:t>
+      </w:r>
+      <w:r>
+        <w:rPr>
+          <w:lang w:val="es-US"/>
+        </w:rPr>
+        <w:t>, PROD-034 con 10,90</w:t>
+      </w:r>
+      <w:r>
+        <w:rPr>
+          <w:lang w:val="es-US"/>
+        </w:rPr>
+        <w:t>%</w:t>
+      </w:r>
+      <w:r>
+        <w:rPr>
+          <w:lang w:val="es-US"/>
+        </w:rPr>
+        <w:t xml:space="preserve"> y PROD-051 con 10,62</w:t>
+      </w:r>
+      <w:r>
+        <w:rPr>
+          <w:lang w:val="es-US"/>
+        </w:rPr>
+        <w:t>%</w:t>
+      </w:r>
+      <w:r>
+        <w:rPr>
+          <w:lang w:val="es-US"/>
+        </w:rPr>
+        <w:t>. Esto no demuestra que el producto cause la desviación; también pueden influir el camión, la ruta y las condiciones operativas.</w:t>
       </w:r>
     </w:p>
     <w:p>
@@ -1742,17 +2470,13 @@
         <w:spacing w:after="80" w:line="252" w:lineRule="auto"/>
         <w:jc w:val="both"/>
         <w:rPr>
-          <w:b/>
-          <w:bCs/>
-          <w:sz w:val="18"/>
-          <w:szCs w:val="18"/>
           <w:lang w:val="es-US"/>
         </w:rPr>
       </w:pPr>
     </w:p>
     <w:tbl>
       <w:tblPr>
-        <w:tblW w:w="9807" w:type="dxa"/>
+        <w:tblW w:w="0" w:type="auto"/>
         <w:jc w:val="center"/>
         <w:tblBorders>
           <w:top w:val="single" w:sz="8" w:space="0" w:color="D9D9D9"/>
@@ -1769,7 +2493,7 @@
         <w:gridCol w:w="1728"/>
         <w:gridCol w:w="2232"/>
         <w:gridCol w:w="3024"/>
-        <w:gridCol w:w="2823"/>
+        <w:gridCol w:w="2974"/>
       </w:tblGrid>
       <w:tr>
         <w:trPr>
@@ -1792,8 +2516,6 @@
             <w:pPr>
               <w:spacing w:after="0"/>
               <w:rPr>
-                <w:sz w:val="18"/>
-                <w:szCs w:val="18"/>
                 <w:lang w:val="es-US"/>
               </w:rPr>
             </w:pPr>
@@ -1801,8 +2523,7 @@
               <w:rPr>
                 <w:b/>
                 <w:color w:val="FFFFFF"/>
-                <w:sz w:val="18"/>
-                <w:szCs w:val="18"/>
+                <w:sz w:val="17"/>
                 <w:lang w:val="es-US"/>
               </w:rPr>
               <w:t>Elemento</w:t>
@@ -1825,8 +2546,6 @@
             <w:pPr>
               <w:spacing w:after="0"/>
               <w:rPr>
-                <w:sz w:val="18"/>
-                <w:szCs w:val="18"/>
                 <w:lang w:val="es-US"/>
               </w:rPr>
             </w:pPr>
@@ -1835,8 +2554,7 @@
               <w:rPr>
                 <w:b/>
                 <w:color w:val="FFFFFF"/>
-                <w:sz w:val="18"/>
-                <w:szCs w:val="18"/>
+                <w:sz w:val="17"/>
                 <w:lang w:val="es-US"/>
               </w:rPr>
               <w:t>Baseline</w:t>
@@ -1860,8 +2578,6 @@
             <w:pPr>
               <w:spacing w:after="0"/>
               <w:rPr>
-                <w:sz w:val="18"/>
-                <w:szCs w:val="18"/>
                 <w:lang w:val="es-US"/>
               </w:rPr>
             </w:pPr>
@@ -1869,8 +2585,7 @@
               <w:rPr>
                 <w:b/>
                 <w:color w:val="FFFFFF"/>
-                <w:sz w:val="18"/>
-                <w:szCs w:val="18"/>
+                <w:sz w:val="17"/>
                 <w:lang w:val="es-US"/>
               </w:rPr>
               <w:t>Regresión logística</w:t>
@@ -1879,7 +2594,7 @@
         </w:tc>
         <w:tc>
           <w:tcPr>
-            <w:tcW w:w="2823" w:type="dxa"/>
+            <w:tcW w:w="2974" w:type="dxa"/>
             <w:shd w:val="clear" w:color="auto" w:fill="1F4E78"/>
             <w:tcMar>
               <w:top w:w="90" w:type="dxa"/>
@@ -1893,8 +2608,6 @@
             <w:pPr>
               <w:spacing w:after="0"/>
               <w:rPr>
-                <w:sz w:val="18"/>
-                <w:szCs w:val="18"/>
                 <w:lang w:val="es-US"/>
               </w:rPr>
             </w:pPr>
@@ -1902,8 +2615,7 @@
               <w:rPr>
                 <w:b/>
                 <w:color w:val="FFFFFF"/>
-                <w:sz w:val="18"/>
-                <w:szCs w:val="18"/>
+                <w:sz w:val="17"/>
                 <w:lang w:val="es-US"/>
               </w:rPr>
               <w:t>Interpretación</w:t>
@@ -1930,15 +2642,12 @@
             <w:pPr>
               <w:spacing w:after="0"/>
               <w:rPr>
-                <w:sz w:val="18"/>
-                <w:szCs w:val="18"/>
                 <w:lang w:val="es-US"/>
               </w:rPr>
             </w:pPr>
             <w:r>
               <w:rPr>
-                <w:sz w:val="18"/>
-                <w:szCs w:val="18"/>
+                <w:sz w:val="17"/>
                 <w:lang w:val="es-US"/>
               </w:rPr>
               <w:t>Técnica</w:t>
@@ -1960,15 +2669,12 @@
             <w:pPr>
               <w:spacing w:after="0"/>
               <w:rPr>
-                <w:sz w:val="18"/>
-                <w:szCs w:val="18"/>
                 <w:lang w:val="es-US"/>
               </w:rPr>
             </w:pPr>
             <w:r>
               <w:rPr>
-                <w:sz w:val="18"/>
-                <w:szCs w:val="18"/>
+                <w:sz w:val="17"/>
                 <w:lang w:val="es-US"/>
               </w:rPr>
               <w:t>Siempre predice 0</w:t>
@@ -1990,15 +2696,12 @@
             <w:pPr>
               <w:spacing w:after="0"/>
               <w:rPr>
-                <w:sz w:val="18"/>
-                <w:szCs w:val="18"/>
                 <w:lang w:val="es-US"/>
               </w:rPr>
             </w:pPr>
             <w:r>
               <w:rPr>
-                <w:sz w:val="18"/>
-                <w:szCs w:val="18"/>
+                <w:sz w:val="17"/>
                 <w:lang w:val="es-US"/>
               </w:rPr>
               <w:t>Cinco predictores clase balanceada</w:t>
@@ -2007,7 +2710,7 @@
         </w:tc>
         <w:tc>
           <w:tcPr>
-            <w:tcW w:w="2823" w:type="dxa"/>
+            <w:tcW w:w="2974" w:type="dxa"/>
             <w:tcMar>
               <w:top w:w="90" w:type="dxa"/>
               <w:left w:w="100" w:type="dxa"/>
@@ -2020,15 +2723,12 @@
             <w:pPr>
               <w:spacing w:after="0"/>
               <w:rPr>
-                <w:sz w:val="18"/>
-                <w:szCs w:val="18"/>
                 <w:lang w:val="es-US"/>
               </w:rPr>
             </w:pPr>
             <w:r>
               <w:rPr>
-                <w:sz w:val="18"/>
-                <w:szCs w:val="18"/>
+                <w:sz w:val="17"/>
                 <w:lang w:val="es-US"/>
               </w:rPr>
               <w:t xml:space="preserve">El </w:t>
@@ -2036,8 +2736,7 @@
             <w:proofErr w:type="spellStart"/>
             <w:r>
               <w:rPr>
-                <w:sz w:val="18"/>
-                <w:szCs w:val="18"/>
+                <w:sz w:val="17"/>
                 <w:lang w:val="es-US"/>
               </w:rPr>
               <w:t>baseline</w:t>
@@ -2045,8 +2744,7 @@
             <w:proofErr w:type="spellEnd"/>
             <w:r>
               <w:rPr>
-                <w:sz w:val="18"/>
-                <w:szCs w:val="18"/>
+                <w:sz w:val="17"/>
                 <w:lang w:val="es-US"/>
               </w:rPr>
               <w:t xml:space="preserve"> no genera alertas</w:t>
@@ -2074,15 +2772,12 @@
             <w:pPr>
               <w:spacing w:after="0"/>
               <w:rPr>
-                <w:sz w:val="18"/>
-                <w:szCs w:val="18"/>
                 <w:lang w:val="es-US"/>
               </w:rPr>
             </w:pPr>
             <w:r>
               <w:rPr>
-                <w:sz w:val="18"/>
-                <w:szCs w:val="18"/>
+                <w:sz w:val="17"/>
                 <w:lang w:val="es-US"/>
               </w:rPr>
               <w:t>Partición</w:t>
@@ -2105,15 +2800,12 @@
             <w:pPr>
               <w:spacing w:after="0"/>
               <w:rPr>
-                <w:sz w:val="18"/>
-                <w:szCs w:val="18"/>
                 <w:lang w:val="es-US"/>
               </w:rPr>
             </w:pPr>
             <w:r>
               <w:rPr>
-                <w:sz w:val="18"/>
-                <w:szCs w:val="18"/>
+                <w:sz w:val="17"/>
                 <w:lang w:val="es-US"/>
               </w:rPr>
               <w:t>Misma prueba</w:t>
@@ -2136,47 +2828,40 @@
             <w:pPr>
               <w:spacing w:after="0"/>
               <w:rPr>
-                <w:sz w:val="18"/>
-                <w:szCs w:val="18"/>
                 <w:lang w:val="es-US"/>
               </w:rPr>
             </w:pPr>
             <w:r>
               <w:rPr>
-                <w:sz w:val="18"/>
-                <w:szCs w:val="18"/>
+                <w:sz w:val="17"/>
                 <w:lang w:val="es-US"/>
               </w:rPr>
               <w:t>80</w:t>
             </w:r>
             <w:r>
               <w:rPr>
-                <w:sz w:val="18"/>
-                <w:szCs w:val="18"/>
+                <w:sz w:val="17"/>
                 <w:lang w:val="es-US"/>
               </w:rPr>
               <w:t>%</w:t>
             </w:r>
             <w:r>
               <w:rPr>
-                <w:sz w:val="18"/>
-                <w:szCs w:val="18"/>
+                <w:sz w:val="17"/>
                 <w:lang w:val="es-US"/>
               </w:rPr>
               <w:t xml:space="preserve"> y 20</w:t>
             </w:r>
             <w:r>
               <w:rPr>
-                <w:sz w:val="18"/>
-                <w:szCs w:val="18"/>
+                <w:sz w:val="17"/>
                 <w:lang w:val="es-US"/>
               </w:rPr>
               <w:t>%</w:t>
             </w:r>
             <w:r>
               <w:rPr>
-                <w:sz w:val="18"/>
-                <w:szCs w:val="18"/>
+                <w:sz w:val="17"/>
                 <w:lang w:val="es-US"/>
               </w:rPr>
               <w:t xml:space="preserve"> por viaje</w:t>
@@ -2185,7 +2870,7 @@
         </w:tc>
         <w:tc>
           <w:tcPr>
-            <w:tcW w:w="2823" w:type="dxa"/>
+            <w:tcW w:w="2974" w:type="dxa"/>
             <w:shd w:val="clear" w:color="auto" w:fill="EAF2F8"/>
             <w:tcMar>
               <w:top w:w="90" w:type="dxa"/>
@@ -2199,15 +2884,12 @@
             <w:pPr>
               <w:spacing w:after="0"/>
               <w:rPr>
-                <w:sz w:val="18"/>
-                <w:szCs w:val="18"/>
                 <w:lang w:val="es-US"/>
               </w:rPr>
             </w:pPr>
             <w:r>
               <w:rPr>
-                <w:sz w:val="18"/>
-                <w:szCs w:val="18"/>
+                <w:sz w:val="17"/>
                 <w:lang w:val="es-US"/>
               </w:rPr>
               <w:t>Cero viajes compartidos</w:t>
@@ -2234,15 +2916,12 @@
             <w:pPr>
               <w:spacing w:after="0"/>
               <w:rPr>
-                <w:sz w:val="18"/>
-                <w:szCs w:val="18"/>
                 <w:lang w:val="es-US"/>
               </w:rPr>
             </w:pPr>
             <w:r>
               <w:rPr>
-                <w:sz w:val="18"/>
-                <w:szCs w:val="18"/>
+                <w:sz w:val="17"/>
                 <w:lang w:val="es-US"/>
               </w:rPr>
               <w:t>Métrica principal</w:t>
@@ -2264,23 +2943,19 @@
             <w:pPr>
               <w:spacing w:after="0"/>
               <w:rPr>
-                <w:sz w:val="18"/>
-                <w:szCs w:val="18"/>
                 <w:lang w:val="es-US"/>
               </w:rPr>
             </w:pPr>
             <w:r>
               <w:rPr>
-                <w:sz w:val="18"/>
-                <w:szCs w:val="18"/>
+                <w:sz w:val="17"/>
                 <w:lang w:val="es-US"/>
               </w:rPr>
               <w:t>PR AUC 5,37</w:t>
             </w:r>
             <w:r>
               <w:rPr>
-                <w:sz w:val="18"/>
-                <w:szCs w:val="18"/>
+                <w:sz w:val="17"/>
                 <w:lang w:val="es-US"/>
               </w:rPr>
               <w:t>%</w:t>
@@ -2302,23 +2977,19 @@
             <w:pPr>
               <w:spacing w:after="0"/>
               <w:rPr>
-                <w:sz w:val="18"/>
-                <w:szCs w:val="18"/>
                 <w:lang w:val="es-US"/>
               </w:rPr>
             </w:pPr>
             <w:r>
               <w:rPr>
-                <w:sz w:val="18"/>
-                <w:szCs w:val="18"/>
+                <w:sz w:val="17"/>
                 <w:lang w:val="es-US"/>
               </w:rPr>
               <w:t>PR AUC 37,32</w:t>
             </w:r>
             <w:r>
               <w:rPr>
-                <w:sz w:val="18"/>
-                <w:szCs w:val="18"/>
+                <w:sz w:val="17"/>
                 <w:lang w:val="es-US"/>
               </w:rPr>
               <w:t>%</w:t>
@@ -2327,7 +2998,7 @@
         </w:tc>
         <w:tc>
           <w:tcPr>
-            <w:tcW w:w="2823" w:type="dxa"/>
+            <w:tcW w:w="2974" w:type="dxa"/>
             <w:tcMar>
               <w:top w:w="90" w:type="dxa"/>
               <w:left w:w="100" w:type="dxa"/>
@@ -2340,15 +3011,12 @@
             <w:pPr>
               <w:spacing w:after="0"/>
               <w:rPr>
-                <w:sz w:val="18"/>
-                <w:szCs w:val="18"/>
                 <w:lang w:val="es-US"/>
               </w:rPr>
             </w:pPr>
             <w:r>
               <w:rPr>
-                <w:sz w:val="18"/>
-                <w:szCs w:val="18"/>
+                <w:sz w:val="17"/>
                 <w:lang w:val="es-US"/>
               </w:rPr>
               <w:t>Mejora en clase poco frecuente</w:t>
@@ -2376,15 +3044,12 @@
             <w:pPr>
               <w:spacing w:after="0"/>
               <w:rPr>
-                <w:sz w:val="18"/>
-                <w:szCs w:val="18"/>
                 <w:lang w:val="es-US"/>
               </w:rPr>
             </w:pPr>
             <w:r>
               <w:rPr>
-                <w:sz w:val="18"/>
-                <w:szCs w:val="18"/>
+                <w:sz w:val="17"/>
                 <w:lang w:val="es-US"/>
               </w:rPr>
               <w:t>Error relevante</w:t>
@@ -2407,16 +3072,13 @@
             <w:pPr>
               <w:spacing w:after="0"/>
               <w:rPr>
-                <w:sz w:val="18"/>
-                <w:szCs w:val="18"/>
                 <w:lang w:val="es-US"/>
               </w:rPr>
             </w:pPr>
             <w:proofErr w:type="spellStart"/>
             <w:r>
               <w:rPr>
-                <w:sz w:val="18"/>
-                <w:szCs w:val="18"/>
+                <w:sz w:val="17"/>
                 <w:lang w:val="es-US"/>
               </w:rPr>
               <w:t>Recall</w:t>
@@ -2424,16 +3086,14 @@
             <w:proofErr w:type="spellEnd"/>
             <w:r>
               <w:rPr>
-                <w:sz w:val="18"/>
-                <w:szCs w:val="18"/>
+                <w:sz w:val="17"/>
                 <w:lang w:val="es-US"/>
               </w:rPr>
               <w:t xml:space="preserve"> 0</w:t>
             </w:r>
             <w:r>
               <w:rPr>
-                <w:sz w:val="18"/>
-                <w:szCs w:val="18"/>
+                <w:sz w:val="17"/>
                 <w:lang w:val="es-US"/>
               </w:rPr>
               <w:t>%</w:t>
@@ -2456,15 +3116,12 @@
             <w:pPr>
               <w:spacing w:after="0"/>
               <w:rPr>
-                <w:sz w:val="18"/>
-                <w:szCs w:val="18"/>
                 <w:lang w:val="es-US"/>
               </w:rPr>
             </w:pPr>
             <w:r>
               <w:rPr>
-                <w:sz w:val="18"/>
-                <w:szCs w:val="18"/>
+                <w:sz w:val="17"/>
                 <w:lang w:val="es-US"/>
               </w:rPr>
               <w:t xml:space="preserve">148 falsos negativos </w:t>
@@ -2472,8 +3129,7 @@
             <w:proofErr w:type="spellStart"/>
             <w:r>
               <w:rPr>
-                <w:sz w:val="18"/>
-                <w:szCs w:val="18"/>
+                <w:sz w:val="17"/>
                 <w:lang w:val="es-US"/>
               </w:rPr>
               <w:t>recall</w:t>
@@ -2481,16 +3137,14 @@
             <w:proofErr w:type="spellEnd"/>
             <w:r>
               <w:rPr>
-                <w:sz w:val="18"/>
-                <w:szCs w:val="18"/>
+                <w:sz w:val="17"/>
                 <w:lang w:val="es-US"/>
               </w:rPr>
               <w:t xml:space="preserve"> 46,76</w:t>
             </w:r>
             <w:r>
               <w:rPr>
-                <w:sz w:val="18"/>
-                <w:szCs w:val="18"/>
+                <w:sz w:val="17"/>
                 <w:lang w:val="es-US"/>
               </w:rPr>
               <w:t>%</w:t>
@@ -2499,7 +3153,7 @@
         </w:tc>
         <w:tc>
           <w:tcPr>
-            <w:tcW w:w="2823" w:type="dxa"/>
+            <w:tcW w:w="2974" w:type="dxa"/>
             <w:shd w:val="clear" w:color="auto" w:fill="EAF2F8"/>
             <w:tcMar>
               <w:top w:w="90" w:type="dxa"/>
@@ -2513,15 +3167,12 @@
             <w:pPr>
               <w:spacing w:after="0"/>
               <w:rPr>
-                <w:sz w:val="18"/>
-                <w:szCs w:val="18"/>
                 <w:lang w:val="es-US"/>
               </w:rPr>
             </w:pPr>
             <w:r>
               <w:rPr>
-                <w:sz w:val="18"/>
-                <w:szCs w:val="18"/>
+                <w:sz w:val="17"/>
                 <w:lang w:val="es-US"/>
               </w:rPr>
               <w:t>Aún omite eventos reales</w:t>
@@ -2532,6 +3183,8 @@
     </w:tbl>
     <w:p>
       <w:pPr>
+        <w:pStyle w:val="Caption"/>
+        <w:keepNext/>
         <w:rPr>
           <w:lang w:val="es-US"/>
         </w:rPr>
@@ -2539,19 +3192,29 @@
     </w:p>
     <w:p>
       <w:pPr>
+        <w:pStyle w:val="Caption"/>
+        <w:keepNext/>
         <w:rPr>
           <w:lang w:val="es-US"/>
         </w:rPr>
       </w:pPr>
       <w:r>
         <w:rPr>
-          <w:b/>
-          <w:bCs/>
-          <w:sz w:val="18"/>
-          <w:szCs w:val="18"/>
-          <w:lang w:val="es-US"/>
-        </w:rPr>
-        <w:t>Figura 3 Matriz de confusión del conjunto de prueba</w:t>
+          <w:lang w:val="es-US"/>
+        </w:rPr>
+        <w:t>Figura 4</w:t>
+      </w:r>
+      <w:r>
+        <w:rPr>
+          <w:lang w:val="es-US"/>
+        </w:rPr>
+        <w:t>:</w:t>
+      </w:r>
+      <w:r>
+        <w:rPr>
+          <w:lang w:val="es-US"/>
+        </w:rPr>
+        <w:t xml:space="preserve"> Matriz de confusión del conjunto de prueba</w:t>
       </w:r>
     </w:p>
     <w:p>
@@ -2568,10 +3231,10 @@
           <w:lang w:val="es-US"/>
         </w:rPr>
         <w:drawing>
-          <wp:inline distT="0" distB="0" distL="0" distR="0" wp14:anchorId="6352E96E" wp14:editId="7ED21FA9">
+          <wp:inline distT="0" distB="0" distL="0" distR="0" wp14:anchorId="1C0E370E" wp14:editId="6862D259">
             <wp:extent cx="3840480" cy="3078312"/>
             <wp:effectExtent l="0" t="0" r="0" b="0"/>
-            <wp:docPr id="3" name="Picture 3" descr="Matriz con 4565 verdaderos negativos 331 falsos positivos 148 falsos negativos y 130 verdaderos positivos"/>
+            <wp:docPr id="4" name="Picture 4" descr="Matriz con 4565 verdaderos negativos 331 falsos positivos 148 falsos negativos y 130 verdaderos positivos"/>
             <wp:cNvGraphicFramePr>
               <a:graphicFrameLocks xmlns:a="http://schemas.openxmlformats.org/drawingml/2006/main" noChangeAspect="1"/>
             </wp:cNvGraphicFramePr>
@@ -2583,7 +3246,7 @@
                     <pic:cNvPicPr/>
                   </pic:nvPicPr>
                   <pic:blipFill>
-                    <a:blip r:embed="rId10"/>
+                    <a:blip r:embed="rId11"/>
                     <a:stretch>
                       <a:fillRect/>
                     </a:stretch>
@@ -2607,15 +3270,6 @@
     <w:p>
       <w:pPr>
         <w:spacing w:after="80" w:line="252" w:lineRule="auto"/>
-        <w:jc w:val="center"/>
-        <w:rPr>
-          <w:lang w:val="es-US"/>
-        </w:rPr>
-      </w:pPr>
-    </w:p>
-    <w:p>
-      <w:pPr>
-        <w:spacing w:after="80" w:line="252" w:lineRule="auto"/>
         <w:jc w:val="both"/>
         <w:rPr>
           <w:lang w:val="es-US"/>
@@ -2704,7 +3358,7 @@
     </w:p>
     <w:p>
       <w:pPr>
-        <w:spacing w:after="80" w:line="252" w:lineRule="auto"/>
+        <w:pStyle w:val="Heading2"/>
         <w:rPr>
           <w:lang w:val="es-US"/>
         </w:rPr>
@@ -2713,65 +3367,7 @@
         <w:rPr>
           <w:lang w:val="es-US"/>
         </w:rPr>
-        <w:br w:type="page"/>
-      </w:r>
-    </w:p>
-    <w:p>
-      <w:pPr>
-        <w:pStyle w:val="Heading1"/>
-        <w:rPr>
-          <w:lang w:val="es-US"/>
-        </w:rPr>
-      </w:pPr>
-      <w:r>
-        <w:rPr>
-          <w:lang w:val="es-US"/>
-        </w:rPr>
-        <w:lastRenderedPageBreak/>
-        <w:t>E</w:t>
-      </w:r>
-      <w:r>
-        <w:rPr>
-          <w:lang w:val="es-US"/>
-        </w:rPr>
-        <w:t>.</w:t>
-      </w:r>
-      <w:r>
-        <w:rPr>
-          <w:lang w:val="es-US"/>
-        </w:rPr>
-        <w:t xml:space="preserve"> Interpretación y decisión</w:t>
-      </w:r>
-    </w:p>
-    <w:p>
-      <w:pPr>
-        <w:spacing w:after="80" w:line="252" w:lineRule="auto"/>
-        <w:jc w:val="both"/>
-        <w:rPr>
-          <w:lang w:val="es-US"/>
-        </w:rPr>
-      </w:pPr>
-      <w:r>
-        <w:rPr>
-          <w:b/>
-          <w:bCs/>
-          <w:lang w:val="es-US"/>
-        </w:rPr>
-        <w:t>Hallazgo principal</w:t>
-      </w:r>
-      <w:r>
-        <w:rPr>
-          <w:b/>
-          <w:bCs/>
-          <w:lang w:val="es-US"/>
-        </w:rPr>
-        <w:t>:</w:t>
-      </w:r>
-      <w:r>
-        <w:rPr>
-          <w:lang w:val="es-US"/>
-        </w:rPr>
-        <w:t xml:space="preserve"> Las condiciones actuales contienen una señal útil para ordenar el riesgo futuro. La desviación presente es el indicador más claro del modelo, pero la alerta no debe interpretarse como una causa ni como una decisión automática. El resultado observado es una asociación predictiva en los datos disponibles; la recomendación es iniciar una validación operativa supervisada.</w:t>
+        <w:t>Desempeño según la desviación actual</w:t>
       </w:r>
     </w:p>
     <w:tbl>
@@ -2790,10 +3386,1587 @@
         <w:tblLook w:val="04A0" w:firstRow="1" w:lastRow="0" w:firstColumn="1" w:lastColumn="0" w:noHBand="0" w:noVBand="1"/>
       </w:tblPr>
       <w:tblGrid>
+        <w:gridCol w:w="2088"/>
+        <w:gridCol w:w="1224"/>
+        <w:gridCol w:w="1224"/>
+        <w:gridCol w:w="1296"/>
+        <w:gridCol w:w="1224"/>
+        <w:gridCol w:w="1296"/>
+        <w:gridCol w:w="1368"/>
+      </w:tblGrid>
+      <w:tr>
+        <w:trPr>
+          <w:tblHeader/>
+          <w:jc w:val="center"/>
+        </w:trPr>
+        <w:tc>
+          <w:tcPr>
+            <w:tcW w:w="2088" w:type="dxa"/>
+            <w:shd w:val="clear" w:color="auto" w:fill="1F4E78"/>
+            <w:tcMar>
+              <w:top w:w="90" w:type="dxa"/>
+              <w:left w:w="100" w:type="dxa"/>
+              <w:bottom w:w="90" w:type="dxa"/>
+              <w:right w:w="100" w:type="dxa"/>
+            </w:tcMar>
+            <w:vAlign w:val="center"/>
+          </w:tcPr>
+          <w:p>
+            <w:pPr>
+              <w:spacing w:after="0"/>
+              <w:rPr>
+                <w:lang w:val="es-US"/>
+              </w:rPr>
+            </w:pPr>
+            <w:r>
+              <w:rPr>
+                <w:b/>
+                <w:color w:val="FFFFFF"/>
+                <w:sz w:val="17"/>
+                <w:lang w:val="es-US"/>
+              </w:rPr>
+              <w:t>Estado actual</w:t>
+            </w:r>
+          </w:p>
+        </w:tc>
+        <w:tc>
+          <w:tcPr>
+            <w:tcW w:w="1224" w:type="dxa"/>
+            <w:shd w:val="clear" w:color="auto" w:fill="1F4E78"/>
+            <w:tcMar>
+              <w:top w:w="90" w:type="dxa"/>
+              <w:left w:w="100" w:type="dxa"/>
+              <w:bottom w:w="90" w:type="dxa"/>
+              <w:right w:w="100" w:type="dxa"/>
+            </w:tcMar>
+            <w:vAlign w:val="center"/>
+          </w:tcPr>
+          <w:p>
+            <w:pPr>
+              <w:spacing w:after="0"/>
+              <w:rPr>
+                <w:lang w:val="es-US"/>
+              </w:rPr>
+            </w:pPr>
+            <w:r>
+              <w:rPr>
+                <w:b/>
+                <w:color w:val="FFFFFF"/>
+                <w:sz w:val="17"/>
+                <w:lang w:val="es-US"/>
+              </w:rPr>
+              <w:t>Lecturas</w:t>
+            </w:r>
+          </w:p>
+        </w:tc>
+        <w:tc>
+          <w:tcPr>
+            <w:tcW w:w="1224" w:type="dxa"/>
+            <w:shd w:val="clear" w:color="auto" w:fill="1F4E78"/>
+            <w:tcMar>
+              <w:top w:w="90" w:type="dxa"/>
+              <w:left w:w="100" w:type="dxa"/>
+              <w:bottom w:w="90" w:type="dxa"/>
+              <w:right w:w="100" w:type="dxa"/>
+            </w:tcMar>
+            <w:vAlign w:val="center"/>
+          </w:tcPr>
+          <w:p>
+            <w:pPr>
+              <w:spacing w:after="0"/>
+              <w:rPr>
+                <w:lang w:val="es-US"/>
+              </w:rPr>
+            </w:pPr>
+            <w:r>
+              <w:rPr>
+                <w:b/>
+                <w:color w:val="FFFFFF"/>
+                <w:sz w:val="17"/>
+                <w:lang w:val="es-US"/>
+              </w:rPr>
+              <w:t>Positivos</w:t>
+            </w:r>
+          </w:p>
+        </w:tc>
+        <w:tc>
+          <w:tcPr>
+            <w:tcW w:w="1296" w:type="dxa"/>
+            <w:shd w:val="clear" w:color="auto" w:fill="1F4E78"/>
+            <w:tcMar>
+              <w:top w:w="90" w:type="dxa"/>
+              <w:left w:w="100" w:type="dxa"/>
+              <w:bottom w:w="90" w:type="dxa"/>
+              <w:right w:w="100" w:type="dxa"/>
+            </w:tcMar>
+            <w:vAlign w:val="center"/>
+          </w:tcPr>
+          <w:p>
+            <w:pPr>
+              <w:spacing w:after="0"/>
+              <w:rPr>
+                <w:lang w:val="es-US"/>
+              </w:rPr>
+            </w:pPr>
+            <w:r>
+              <w:rPr>
+                <w:b/>
+                <w:color w:val="FFFFFF"/>
+                <w:sz w:val="17"/>
+                <w:lang w:val="es-US"/>
+              </w:rPr>
+              <w:t>Detectados</w:t>
+            </w:r>
+          </w:p>
+        </w:tc>
+        <w:tc>
+          <w:tcPr>
+            <w:tcW w:w="1224" w:type="dxa"/>
+            <w:shd w:val="clear" w:color="auto" w:fill="1F4E78"/>
+            <w:tcMar>
+              <w:top w:w="90" w:type="dxa"/>
+              <w:left w:w="100" w:type="dxa"/>
+              <w:bottom w:w="90" w:type="dxa"/>
+              <w:right w:w="100" w:type="dxa"/>
+            </w:tcMar>
+            <w:vAlign w:val="center"/>
+          </w:tcPr>
+          <w:p>
+            <w:pPr>
+              <w:spacing w:after="0"/>
+              <w:rPr>
+                <w:lang w:val="es-US"/>
+              </w:rPr>
+            </w:pPr>
+            <w:r>
+              <w:rPr>
+                <w:b/>
+                <w:color w:val="FFFFFF"/>
+                <w:sz w:val="17"/>
+                <w:lang w:val="es-US"/>
+              </w:rPr>
+              <w:t>Omitidos</w:t>
+            </w:r>
+          </w:p>
+        </w:tc>
+        <w:tc>
+          <w:tcPr>
+            <w:tcW w:w="1296" w:type="dxa"/>
+            <w:shd w:val="clear" w:color="auto" w:fill="1F4E78"/>
+            <w:tcMar>
+              <w:top w:w="90" w:type="dxa"/>
+              <w:left w:w="100" w:type="dxa"/>
+              <w:bottom w:w="90" w:type="dxa"/>
+              <w:right w:w="100" w:type="dxa"/>
+            </w:tcMar>
+            <w:vAlign w:val="center"/>
+          </w:tcPr>
+          <w:p>
+            <w:pPr>
+              <w:spacing w:after="0"/>
+              <w:rPr>
+                <w:lang w:val="es-US"/>
+              </w:rPr>
+            </w:pPr>
+            <w:proofErr w:type="spellStart"/>
+            <w:r>
+              <w:rPr>
+                <w:b/>
+                <w:color w:val="FFFFFF"/>
+                <w:sz w:val="17"/>
+                <w:lang w:val="es-US"/>
+              </w:rPr>
+              <w:t>Recall</w:t>
+            </w:r>
+            <w:proofErr w:type="spellEnd"/>
+          </w:p>
+        </w:tc>
+        <w:tc>
+          <w:tcPr>
+            <w:tcW w:w="1368" w:type="dxa"/>
+            <w:shd w:val="clear" w:color="auto" w:fill="1F4E78"/>
+            <w:tcMar>
+              <w:top w:w="90" w:type="dxa"/>
+              <w:left w:w="100" w:type="dxa"/>
+              <w:bottom w:w="90" w:type="dxa"/>
+              <w:right w:w="100" w:type="dxa"/>
+            </w:tcMar>
+            <w:vAlign w:val="center"/>
+          </w:tcPr>
+          <w:p>
+            <w:pPr>
+              <w:spacing w:after="0"/>
+              <w:rPr>
+                <w:lang w:val="es-US"/>
+              </w:rPr>
+            </w:pPr>
+            <w:r>
+              <w:rPr>
+                <w:b/>
+                <w:color w:val="FFFFFF"/>
+                <w:sz w:val="17"/>
+                <w:lang w:val="es-US"/>
+              </w:rPr>
+              <w:t>Precisión</w:t>
+            </w:r>
+          </w:p>
+        </w:tc>
+      </w:tr>
+      <w:tr>
+        <w:trPr>
+          <w:jc w:val="center"/>
+        </w:trPr>
+        <w:tc>
+          <w:tcPr>
+            <w:tcW w:w="2088" w:type="dxa"/>
+            <w:tcMar>
+              <w:top w:w="90" w:type="dxa"/>
+              <w:left w:w="100" w:type="dxa"/>
+              <w:bottom w:w="90" w:type="dxa"/>
+              <w:right w:w="100" w:type="dxa"/>
+            </w:tcMar>
+            <w:vAlign w:val="center"/>
+          </w:tcPr>
+          <w:p>
+            <w:pPr>
+              <w:spacing w:after="0"/>
+              <w:rPr>
+                <w:lang w:val="es-US"/>
+              </w:rPr>
+            </w:pPr>
+            <w:r>
+              <w:rPr>
+                <w:sz w:val="17"/>
+                <w:lang w:val="es-US"/>
+              </w:rPr>
+              <w:t>Sin desviación</w:t>
+            </w:r>
+          </w:p>
+        </w:tc>
+        <w:tc>
+          <w:tcPr>
+            <w:tcW w:w="1224" w:type="dxa"/>
+            <w:tcMar>
+              <w:top w:w="90" w:type="dxa"/>
+              <w:left w:w="100" w:type="dxa"/>
+              <w:bottom w:w="90" w:type="dxa"/>
+              <w:right w:w="100" w:type="dxa"/>
+            </w:tcMar>
+            <w:vAlign w:val="center"/>
+          </w:tcPr>
+          <w:p>
+            <w:pPr>
+              <w:spacing w:after="0"/>
+              <w:rPr>
+                <w:lang w:val="es-US"/>
+              </w:rPr>
+            </w:pPr>
+            <w:r>
+              <w:rPr>
+                <w:sz w:val="17"/>
+                <w:lang w:val="es-US"/>
+              </w:rPr>
+              <w:t>4976</w:t>
+            </w:r>
+          </w:p>
+        </w:tc>
+        <w:tc>
+          <w:tcPr>
+            <w:tcW w:w="1224" w:type="dxa"/>
+            <w:tcMar>
+              <w:top w:w="90" w:type="dxa"/>
+              <w:left w:w="100" w:type="dxa"/>
+              <w:bottom w:w="90" w:type="dxa"/>
+              <w:right w:w="100" w:type="dxa"/>
+            </w:tcMar>
+            <w:vAlign w:val="center"/>
+          </w:tcPr>
+          <w:p>
+            <w:pPr>
+              <w:spacing w:after="0"/>
+              <w:rPr>
+                <w:lang w:val="es-US"/>
+              </w:rPr>
+            </w:pPr>
+            <w:r>
+              <w:rPr>
+                <w:sz w:val="17"/>
+                <w:lang w:val="es-US"/>
+              </w:rPr>
+              <w:t>158</w:t>
+            </w:r>
+          </w:p>
+        </w:tc>
+        <w:tc>
+          <w:tcPr>
+            <w:tcW w:w="1296" w:type="dxa"/>
+            <w:tcMar>
+              <w:top w:w="90" w:type="dxa"/>
+              <w:left w:w="100" w:type="dxa"/>
+              <w:bottom w:w="90" w:type="dxa"/>
+              <w:right w:w="100" w:type="dxa"/>
+            </w:tcMar>
+            <w:vAlign w:val="center"/>
+          </w:tcPr>
+          <w:p>
+            <w:pPr>
+              <w:spacing w:after="0"/>
+              <w:rPr>
+                <w:lang w:val="es-US"/>
+              </w:rPr>
+            </w:pPr>
+            <w:r>
+              <w:rPr>
+                <w:sz w:val="17"/>
+                <w:lang w:val="es-US"/>
+              </w:rPr>
+              <w:t>10</w:t>
+            </w:r>
+          </w:p>
+        </w:tc>
+        <w:tc>
+          <w:tcPr>
+            <w:tcW w:w="1224" w:type="dxa"/>
+            <w:tcMar>
+              <w:top w:w="90" w:type="dxa"/>
+              <w:left w:w="100" w:type="dxa"/>
+              <w:bottom w:w="90" w:type="dxa"/>
+              <w:right w:w="100" w:type="dxa"/>
+            </w:tcMar>
+            <w:vAlign w:val="center"/>
+          </w:tcPr>
+          <w:p>
+            <w:pPr>
+              <w:spacing w:after="0"/>
+              <w:rPr>
+                <w:lang w:val="es-US"/>
+              </w:rPr>
+            </w:pPr>
+            <w:r>
+              <w:rPr>
+                <w:sz w:val="17"/>
+                <w:lang w:val="es-US"/>
+              </w:rPr>
+              <w:t>148</w:t>
+            </w:r>
+          </w:p>
+        </w:tc>
+        <w:tc>
+          <w:tcPr>
+            <w:tcW w:w="1296" w:type="dxa"/>
+            <w:tcMar>
+              <w:top w:w="90" w:type="dxa"/>
+              <w:left w:w="100" w:type="dxa"/>
+              <w:bottom w:w="90" w:type="dxa"/>
+              <w:right w:w="100" w:type="dxa"/>
+            </w:tcMar>
+            <w:vAlign w:val="center"/>
+          </w:tcPr>
+          <w:p>
+            <w:pPr>
+              <w:spacing w:after="0"/>
+              <w:rPr>
+                <w:lang w:val="es-US"/>
+              </w:rPr>
+            </w:pPr>
+            <w:r>
+              <w:rPr>
+                <w:sz w:val="17"/>
+                <w:lang w:val="es-US"/>
+              </w:rPr>
+              <w:t>6,33 %</w:t>
+            </w:r>
+          </w:p>
+        </w:tc>
+        <w:tc>
+          <w:tcPr>
+            <w:tcW w:w="1368" w:type="dxa"/>
+            <w:tcMar>
+              <w:top w:w="90" w:type="dxa"/>
+              <w:left w:w="100" w:type="dxa"/>
+              <w:bottom w:w="90" w:type="dxa"/>
+              <w:right w:w="100" w:type="dxa"/>
+            </w:tcMar>
+            <w:vAlign w:val="center"/>
+          </w:tcPr>
+          <w:p>
+            <w:pPr>
+              <w:spacing w:after="0"/>
+              <w:rPr>
+                <w:lang w:val="es-US"/>
+              </w:rPr>
+            </w:pPr>
+            <w:r>
+              <w:rPr>
+                <w:sz w:val="17"/>
+                <w:lang w:val="es-US"/>
+              </w:rPr>
+              <w:t>3,80 %</w:t>
+            </w:r>
+          </w:p>
+        </w:tc>
+      </w:tr>
+      <w:tr>
+        <w:trPr>
+          <w:jc w:val="center"/>
+        </w:trPr>
+        <w:tc>
+          <w:tcPr>
+            <w:tcW w:w="2088" w:type="dxa"/>
+            <w:shd w:val="clear" w:color="auto" w:fill="EAF2F8"/>
+            <w:tcMar>
+              <w:top w:w="90" w:type="dxa"/>
+              <w:left w:w="100" w:type="dxa"/>
+              <w:bottom w:w="90" w:type="dxa"/>
+              <w:right w:w="100" w:type="dxa"/>
+            </w:tcMar>
+            <w:vAlign w:val="center"/>
+          </w:tcPr>
+          <w:p>
+            <w:pPr>
+              <w:spacing w:after="0"/>
+              <w:rPr>
+                <w:lang w:val="es-US"/>
+              </w:rPr>
+            </w:pPr>
+            <w:r>
+              <w:rPr>
+                <w:sz w:val="17"/>
+                <w:lang w:val="es-US"/>
+              </w:rPr>
+              <w:t>Con desviación</w:t>
+            </w:r>
+          </w:p>
+        </w:tc>
+        <w:tc>
+          <w:tcPr>
+            <w:tcW w:w="1224" w:type="dxa"/>
+            <w:shd w:val="clear" w:color="auto" w:fill="EAF2F8"/>
+            <w:tcMar>
+              <w:top w:w="90" w:type="dxa"/>
+              <w:left w:w="100" w:type="dxa"/>
+              <w:bottom w:w="90" w:type="dxa"/>
+              <w:right w:w="100" w:type="dxa"/>
+            </w:tcMar>
+            <w:vAlign w:val="center"/>
+          </w:tcPr>
+          <w:p>
+            <w:pPr>
+              <w:spacing w:after="0"/>
+              <w:rPr>
+                <w:lang w:val="es-US"/>
+              </w:rPr>
+            </w:pPr>
+            <w:r>
+              <w:rPr>
+                <w:sz w:val="17"/>
+                <w:lang w:val="es-US"/>
+              </w:rPr>
+              <w:t>198</w:t>
+            </w:r>
+          </w:p>
+        </w:tc>
+        <w:tc>
+          <w:tcPr>
+            <w:tcW w:w="1224" w:type="dxa"/>
+            <w:shd w:val="clear" w:color="auto" w:fill="EAF2F8"/>
+            <w:tcMar>
+              <w:top w:w="90" w:type="dxa"/>
+              <w:left w:w="100" w:type="dxa"/>
+              <w:bottom w:w="90" w:type="dxa"/>
+              <w:right w:w="100" w:type="dxa"/>
+            </w:tcMar>
+            <w:vAlign w:val="center"/>
+          </w:tcPr>
+          <w:p>
+            <w:pPr>
+              <w:spacing w:after="0"/>
+              <w:rPr>
+                <w:lang w:val="es-US"/>
+              </w:rPr>
+            </w:pPr>
+            <w:r>
+              <w:rPr>
+                <w:sz w:val="17"/>
+                <w:lang w:val="es-US"/>
+              </w:rPr>
+              <w:t>120</w:t>
+            </w:r>
+          </w:p>
+        </w:tc>
+        <w:tc>
+          <w:tcPr>
+            <w:tcW w:w="1296" w:type="dxa"/>
+            <w:shd w:val="clear" w:color="auto" w:fill="EAF2F8"/>
+            <w:tcMar>
+              <w:top w:w="90" w:type="dxa"/>
+              <w:left w:w="100" w:type="dxa"/>
+              <w:bottom w:w="90" w:type="dxa"/>
+              <w:right w:w="100" w:type="dxa"/>
+            </w:tcMar>
+            <w:vAlign w:val="center"/>
+          </w:tcPr>
+          <w:p>
+            <w:pPr>
+              <w:spacing w:after="0"/>
+              <w:rPr>
+                <w:lang w:val="es-US"/>
+              </w:rPr>
+            </w:pPr>
+            <w:r>
+              <w:rPr>
+                <w:sz w:val="17"/>
+                <w:lang w:val="es-US"/>
+              </w:rPr>
+              <w:t>120</w:t>
+            </w:r>
+          </w:p>
+        </w:tc>
+        <w:tc>
+          <w:tcPr>
+            <w:tcW w:w="1224" w:type="dxa"/>
+            <w:shd w:val="clear" w:color="auto" w:fill="EAF2F8"/>
+            <w:tcMar>
+              <w:top w:w="90" w:type="dxa"/>
+              <w:left w:w="100" w:type="dxa"/>
+              <w:bottom w:w="90" w:type="dxa"/>
+              <w:right w:w="100" w:type="dxa"/>
+            </w:tcMar>
+            <w:vAlign w:val="center"/>
+          </w:tcPr>
+          <w:p>
+            <w:pPr>
+              <w:spacing w:after="0"/>
+              <w:rPr>
+                <w:lang w:val="es-US"/>
+              </w:rPr>
+            </w:pPr>
+            <w:r>
+              <w:rPr>
+                <w:sz w:val="17"/>
+                <w:lang w:val="es-US"/>
+              </w:rPr>
+              <w:t>0</w:t>
+            </w:r>
+          </w:p>
+        </w:tc>
+        <w:tc>
+          <w:tcPr>
+            <w:tcW w:w="1296" w:type="dxa"/>
+            <w:shd w:val="clear" w:color="auto" w:fill="EAF2F8"/>
+            <w:tcMar>
+              <w:top w:w="90" w:type="dxa"/>
+              <w:left w:w="100" w:type="dxa"/>
+              <w:bottom w:w="90" w:type="dxa"/>
+              <w:right w:w="100" w:type="dxa"/>
+            </w:tcMar>
+            <w:vAlign w:val="center"/>
+          </w:tcPr>
+          <w:p>
+            <w:pPr>
+              <w:spacing w:after="0"/>
+              <w:rPr>
+                <w:lang w:val="es-US"/>
+              </w:rPr>
+            </w:pPr>
+            <w:r>
+              <w:rPr>
+                <w:sz w:val="17"/>
+                <w:lang w:val="es-US"/>
+              </w:rPr>
+              <w:t>100,00 %</w:t>
+            </w:r>
+          </w:p>
+        </w:tc>
+        <w:tc>
+          <w:tcPr>
+            <w:tcW w:w="1368" w:type="dxa"/>
+            <w:shd w:val="clear" w:color="auto" w:fill="EAF2F8"/>
+            <w:tcMar>
+              <w:top w:w="90" w:type="dxa"/>
+              <w:left w:w="100" w:type="dxa"/>
+              <w:bottom w:w="90" w:type="dxa"/>
+              <w:right w:w="100" w:type="dxa"/>
+            </w:tcMar>
+            <w:vAlign w:val="center"/>
+          </w:tcPr>
+          <w:p>
+            <w:pPr>
+              <w:spacing w:after="0"/>
+              <w:rPr>
+                <w:lang w:val="es-US"/>
+              </w:rPr>
+            </w:pPr>
+            <w:r>
+              <w:rPr>
+                <w:sz w:val="17"/>
+                <w:lang w:val="es-US"/>
+              </w:rPr>
+              <w:t>60,61 %</w:t>
+            </w:r>
+          </w:p>
+        </w:tc>
+      </w:tr>
+    </w:tbl>
+    <w:p>
+      <w:pPr>
+        <w:spacing w:after="80" w:line="252" w:lineRule="auto"/>
+        <w:jc w:val="both"/>
+        <w:rPr>
+          <w:b/>
+          <w:bCs/>
+          <w:lang w:val="es-US"/>
+        </w:rPr>
+      </w:pPr>
+    </w:p>
+    <w:p>
+      <w:pPr>
+        <w:spacing w:after="80" w:line="252" w:lineRule="auto"/>
+        <w:jc w:val="both"/>
+        <w:rPr>
+          <w:lang w:val="es-US"/>
+        </w:rPr>
+      </w:pPr>
+      <w:r>
+        <w:rPr>
+          <w:b/>
+          <w:bCs/>
+          <w:lang w:val="es-US"/>
+        </w:rPr>
+        <w:t>Interpretación</w:t>
+      </w:r>
+      <w:r>
+        <w:rPr>
+          <w:b/>
+          <w:bCs/>
+          <w:lang w:val="es-US"/>
+        </w:rPr>
+        <w:t>:</w:t>
+      </w:r>
+      <w:r>
+        <w:rPr>
+          <w:lang w:val="es-US"/>
+        </w:rPr>
+        <w:t xml:space="preserve"> Cuando la lectura todavía es normal, el modelo detecta solo 10 de 158 desviaciones nuevas. Cuando la desviación ya está presente, genera una alerta para las 198 lecturas: detecta las 120 continuaciones, pero también produce 78 falsas alertas. Por tanto, el desempeño general describe principalmente la continuidad de problemas existentes y no la capacidad de anticipar eventos nuevos.</w:t>
+      </w:r>
+    </w:p>
+    <w:p>
+      <w:pPr>
+        <w:spacing w:after="80" w:line="252" w:lineRule="auto"/>
+        <w:jc w:val="both"/>
+        <w:rPr>
+          <w:lang w:val="es-US"/>
+        </w:rPr>
+      </w:pPr>
+    </w:p>
+    <w:p>
+      <w:pPr>
+        <w:pStyle w:val="Heading2"/>
+        <w:rPr>
+          <w:lang w:val="es-US"/>
+        </w:rPr>
+      </w:pPr>
+      <w:r>
+        <w:rPr>
+          <w:lang w:val="es-US"/>
+        </w:rPr>
+        <w:lastRenderedPageBreak/>
+        <w:t>Desempeño por grupo térmico observado</w:t>
+      </w:r>
+    </w:p>
+    <w:tbl>
+      <w:tblPr>
+        <w:tblW w:w="0" w:type="auto"/>
+        <w:jc w:val="center"/>
+        <w:tblBorders>
+          <w:top w:val="single" w:sz="8" w:space="0" w:color="D9D9D9"/>
+          <w:left w:val="single" w:sz="8" w:space="0" w:color="D9D9D9"/>
+          <w:bottom w:val="single" w:sz="8" w:space="0" w:color="D9D9D9"/>
+          <w:right w:val="single" w:sz="8" w:space="0" w:color="D9D9D9"/>
+          <w:insideH w:val="single" w:sz="8" w:space="0" w:color="D9D9D9"/>
+          <w:insideV w:val="single" w:sz="8" w:space="0" w:color="D9D9D9"/>
+        </w:tblBorders>
+        <w:tblLayout w:type="fixed"/>
+        <w:tblLook w:val="04A0" w:firstRow="1" w:lastRow="0" w:firstColumn="1" w:lastColumn="0" w:noHBand="0" w:noVBand="1"/>
+      </w:tblPr>
+      <w:tblGrid>
+        <w:gridCol w:w="2880"/>
+        <w:gridCol w:w="1440"/>
+        <w:gridCol w:w="1368"/>
+        <w:gridCol w:w="1440"/>
+        <w:gridCol w:w="1440"/>
+        <w:gridCol w:w="1440"/>
+      </w:tblGrid>
+      <w:tr>
+        <w:trPr>
+          <w:tblHeader/>
+          <w:jc w:val="center"/>
+        </w:trPr>
+        <w:tc>
+          <w:tcPr>
+            <w:tcW w:w="2880" w:type="dxa"/>
+            <w:shd w:val="clear" w:color="auto" w:fill="1F4E78"/>
+            <w:tcMar>
+              <w:top w:w="90" w:type="dxa"/>
+              <w:left w:w="100" w:type="dxa"/>
+              <w:bottom w:w="90" w:type="dxa"/>
+              <w:right w:w="100" w:type="dxa"/>
+            </w:tcMar>
+            <w:vAlign w:val="center"/>
+          </w:tcPr>
+          <w:p>
+            <w:pPr>
+              <w:spacing w:after="0"/>
+              <w:rPr>
+                <w:lang w:val="es-US"/>
+              </w:rPr>
+            </w:pPr>
+            <w:r>
+              <w:rPr>
+                <w:b/>
+                <w:color w:val="FFFFFF"/>
+                <w:sz w:val="17"/>
+                <w:lang w:val="es-US"/>
+              </w:rPr>
+              <w:t>Grupo observado</w:t>
+            </w:r>
+          </w:p>
+        </w:tc>
+        <w:tc>
+          <w:tcPr>
+            <w:tcW w:w="1440" w:type="dxa"/>
+            <w:shd w:val="clear" w:color="auto" w:fill="1F4E78"/>
+            <w:tcMar>
+              <w:top w:w="90" w:type="dxa"/>
+              <w:left w:w="100" w:type="dxa"/>
+              <w:bottom w:w="90" w:type="dxa"/>
+              <w:right w:w="100" w:type="dxa"/>
+            </w:tcMar>
+            <w:vAlign w:val="center"/>
+          </w:tcPr>
+          <w:p>
+            <w:pPr>
+              <w:spacing w:after="0"/>
+              <w:rPr>
+                <w:lang w:val="es-US"/>
+              </w:rPr>
+            </w:pPr>
+            <w:r>
+              <w:rPr>
+                <w:b/>
+                <w:color w:val="FFFFFF"/>
+                <w:sz w:val="17"/>
+                <w:lang w:val="es-US"/>
+              </w:rPr>
+              <w:t>Lecturas</w:t>
+            </w:r>
+          </w:p>
+        </w:tc>
+        <w:tc>
+          <w:tcPr>
+            <w:tcW w:w="1368" w:type="dxa"/>
+            <w:shd w:val="clear" w:color="auto" w:fill="1F4E78"/>
+            <w:tcMar>
+              <w:top w:w="90" w:type="dxa"/>
+              <w:left w:w="100" w:type="dxa"/>
+              <w:bottom w:w="90" w:type="dxa"/>
+              <w:right w:w="100" w:type="dxa"/>
+            </w:tcMar>
+            <w:vAlign w:val="center"/>
+          </w:tcPr>
+          <w:p>
+            <w:pPr>
+              <w:spacing w:after="0"/>
+              <w:rPr>
+                <w:lang w:val="es-US"/>
+              </w:rPr>
+            </w:pPr>
+            <w:r>
+              <w:rPr>
+                <w:b/>
+                <w:color w:val="FFFFFF"/>
+                <w:sz w:val="17"/>
+                <w:lang w:val="es-US"/>
+              </w:rPr>
+              <w:t>Positivos</w:t>
+            </w:r>
+          </w:p>
+        </w:tc>
+        <w:tc>
+          <w:tcPr>
+            <w:tcW w:w="1440" w:type="dxa"/>
+            <w:shd w:val="clear" w:color="auto" w:fill="1F4E78"/>
+            <w:tcMar>
+              <w:top w:w="90" w:type="dxa"/>
+              <w:left w:w="100" w:type="dxa"/>
+              <w:bottom w:w="90" w:type="dxa"/>
+              <w:right w:w="100" w:type="dxa"/>
+            </w:tcMar>
+            <w:vAlign w:val="center"/>
+          </w:tcPr>
+          <w:p>
+            <w:pPr>
+              <w:spacing w:after="0"/>
+              <w:rPr>
+                <w:lang w:val="es-US"/>
+              </w:rPr>
+            </w:pPr>
+            <w:r>
+              <w:rPr>
+                <w:b/>
+                <w:color w:val="FFFFFF"/>
+                <w:sz w:val="17"/>
+                <w:lang w:val="es-US"/>
+              </w:rPr>
+              <w:t>Detectados</w:t>
+            </w:r>
+          </w:p>
+        </w:tc>
+        <w:tc>
+          <w:tcPr>
+            <w:tcW w:w="1440" w:type="dxa"/>
+            <w:shd w:val="clear" w:color="auto" w:fill="1F4E78"/>
+            <w:tcMar>
+              <w:top w:w="90" w:type="dxa"/>
+              <w:left w:w="100" w:type="dxa"/>
+              <w:bottom w:w="90" w:type="dxa"/>
+              <w:right w:w="100" w:type="dxa"/>
+            </w:tcMar>
+            <w:vAlign w:val="center"/>
+          </w:tcPr>
+          <w:p>
+            <w:pPr>
+              <w:spacing w:after="0"/>
+              <w:rPr>
+                <w:lang w:val="es-US"/>
+              </w:rPr>
+            </w:pPr>
+            <w:proofErr w:type="spellStart"/>
+            <w:r>
+              <w:rPr>
+                <w:b/>
+                <w:color w:val="FFFFFF"/>
+                <w:sz w:val="17"/>
+                <w:lang w:val="es-US"/>
+              </w:rPr>
+              <w:t>Recall</w:t>
+            </w:r>
+            <w:proofErr w:type="spellEnd"/>
+          </w:p>
+        </w:tc>
+        <w:tc>
+          <w:tcPr>
+            <w:tcW w:w="1440" w:type="dxa"/>
+            <w:shd w:val="clear" w:color="auto" w:fill="1F4E78"/>
+            <w:tcMar>
+              <w:top w:w="90" w:type="dxa"/>
+              <w:left w:w="100" w:type="dxa"/>
+              <w:bottom w:w="90" w:type="dxa"/>
+              <w:right w:w="100" w:type="dxa"/>
+            </w:tcMar>
+            <w:vAlign w:val="center"/>
+          </w:tcPr>
+          <w:p>
+            <w:pPr>
+              <w:spacing w:after="0"/>
+              <w:rPr>
+                <w:lang w:val="es-US"/>
+              </w:rPr>
+            </w:pPr>
+            <w:r>
+              <w:rPr>
+                <w:b/>
+                <w:color w:val="FFFFFF"/>
+                <w:sz w:val="17"/>
+                <w:lang w:val="es-US"/>
+              </w:rPr>
+              <w:t>Precisión</w:t>
+            </w:r>
+          </w:p>
+        </w:tc>
+      </w:tr>
+      <w:tr>
+        <w:trPr>
+          <w:jc w:val="center"/>
+        </w:trPr>
+        <w:tc>
+          <w:tcPr>
+            <w:tcW w:w="2880" w:type="dxa"/>
+            <w:tcMar>
+              <w:top w:w="90" w:type="dxa"/>
+              <w:left w:w="100" w:type="dxa"/>
+              <w:bottom w:w="90" w:type="dxa"/>
+              <w:right w:w="100" w:type="dxa"/>
+            </w:tcMar>
+            <w:vAlign w:val="center"/>
+          </w:tcPr>
+          <w:p>
+            <w:pPr>
+              <w:spacing w:after="0"/>
+              <w:rPr>
+                <w:lang w:val="es-US"/>
+              </w:rPr>
+            </w:pPr>
+            <w:r>
+              <w:rPr>
+                <w:sz w:val="17"/>
+                <w:lang w:val="es-US"/>
+              </w:rPr>
+              <w:t>Menor a 0 °C</w:t>
+            </w:r>
+          </w:p>
+        </w:tc>
+        <w:tc>
+          <w:tcPr>
+            <w:tcW w:w="1440" w:type="dxa"/>
+            <w:tcMar>
+              <w:top w:w="90" w:type="dxa"/>
+              <w:left w:w="100" w:type="dxa"/>
+              <w:bottom w:w="90" w:type="dxa"/>
+              <w:right w:w="100" w:type="dxa"/>
+            </w:tcMar>
+            <w:vAlign w:val="center"/>
+          </w:tcPr>
+          <w:p>
+            <w:pPr>
+              <w:spacing w:after="0"/>
+              <w:rPr>
+                <w:lang w:val="es-US"/>
+              </w:rPr>
+            </w:pPr>
+            <w:r>
+              <w:rPr>
+                <w:sz w:val="17"/>
+                <w:lang w:val="es-US"/>
+              </w:rPr>
+              <w:t>775</w:t>
+            </w:r>
+          </w:p>
+        </w:tc>
+        <w:tc>
+          <w:tcPr>
+            <w:tcW w:w="1368" w:type="dxa"/>
+            <w:tcMar>
+              <w:top w:w="90" w:type="dxa"/>
+              <w:left w:w="100" w:type="dxa"/>
+              <w:bottom w:w="90" w:type="dxa"/>
+              <w:right w:w="100" w:type="dxa"/>
+            </w:tcMar>
+            <w:vAlign w:val="center"/>
+          </w:tcPr>
+          <w:p>
+            <w:pPr>
+              <w:spacing w:after="0"/>
+              <w:rPr>
+                <w:lang w:val="es-US"/>
+              </w:rPr>
+            </w:pPr>
+            <w:r>
+              <w:rPr>
+                <w:sz w:val="17"/>
+                <w:lang w:val="es-US"/>
+              </w:rPr>
+              <w:t>62</w:t>
+            </w:r>
+          </w:p>
+        </w:tc>
+        <w:tc>
+          <w:tcPr>
+            <w:tcW w:w="1440" w:type="dxa"/>
+            <w:tcMar>
+              <w:top w:w="90" w:type="dxa"/>
+              <w:left w:w="100" w:type="dxa"/>
+              <w:bottom w:w="90" w:type="dxa"/>
+              <w:right w:w="100" w:type="dxa"/>
+            </w:tcMar>
+            <w:vAlign w:val="center"/>
+          </w:tcPr>
+          <w:p>
+            <w:pPr>
+              <w:spacing w:after="0"/>
+              <w:rPr>
+                <w:lang w:val="es-US"/>
+              </w:rPr>
+            </w:pPr>
+            <w:r>
+              <w:rPr>
+                <w:sz w:val="17"/>
+                <w:lang w:val="es-US"/>
+              </w:rPr>
+              <w:t>39</w:t>
+            </w:r>
+          </w:p>
+        </w:tc>
+        <w:tc>
+          <w:tcPr>
+            <w:tcW w:w="1440" w:type="dxa"/>
+            <w:tcMar>
+              <w:top w:w="90" w:type="dxa"/>
+              <w:left w:w="100" w:type="dxa"/>
+              <w:bottom w:w="90" w:type="dxa"/>
+              <w:right w:w="100" w:type="dxa"/>
+            </w:tcMar>
+            <w:vAlign w:val="center"/>
+          </w:tcPr>
+          <w:p>
+            <w:pPr>
+              <w:spacing w:after="0"/>
+              <w:rPr>
+                <w:lang w:val="es-US"/>
+              </w:rPr>
+            </w:pPr>
+            <w:r>
+              <w:rPr>
+                <w:sz w:val="17"/>
+                <w:lang w:val="es-US"/>
+              </w:rPr>
+              <w:t>62,90 %</w:t>
+            </w:r>
+          </w:p>
+        </w:tc>
+        <w:tc>
+          <w:tcPr>
+            <w:tcW w:w="1440" w:type="dxa"/>
+            <w:tcMar>
+              <w:top w:w="90" w:type="dxa"/>
+              <w:left w:w="100" w:type="dxa"/>
+              <w:bottom w:w="90" w:type="dxa"/>
+              <w:right w:w="100" w:type="dxa"/>
+            </w:tcMar>
+            <w:vAlign w:val="center"/>
+          </w:tcPr>
+          <w:p>
+            <w:pPr>
+              <w:spacing w:after="0"/>
+              <w:rPr>
+                <w:lang w:val="es-US"/>
+              </w:rPr>
+            </w:pPr>
+            <w:r>
+              <w:rPr>
+                <w:sz w:val="17"/>
+                <w:lang w:val="es-US"/>
+              </w:rPr>
+              <w:t>15,48 %</w:t>
+            </w:r>
+          </w:p>
+        </w:tc>
+      </w:tr>
+      <w:tr>
+        <w:trPr>
+          <w:jc w:val="center"/>
+        </w:trPr>
+        <w:tc>
+          <w:tcPr>
+            <w:tcW w:w="2880" w:type="dxa"/>
+            <w:shd w:val="clear" w:color="auto" w:fill="EAF2F8"/>
+            <w:tcMar>
+              <w:top w:w="90" w:type="dxa"/>
+              <w:left w:w="100" w:type="dxa"/>
+              <w:bottom w:w="90" w:type="dxa"/>
+              <w:right w:w="100" w:type="dxa"/>
+            </w:tcMar>
+            <w:vAlign w:val="center"/>
+          </w:tcPr>
+          <w:p>
+            <w:pPr>
+              <w:spacing w:after="0"/>
+              <w:rPr>
+                <w:lang w:val="es-US"/>
+              </w:rPr>
+            </w:pPr>
+            <w:r>
+              <w:rPr>
+                <w:sz w:val="17"/>
+                <w:lang w:val="es-US"/>
+              </w:rPr>
+              <w:t>Entre 0 y 10 °C</w:t>
+            </w:r>
+          </w:p>
+        </w:tc>
+        <w:tc>
+          <w:tcPr>
+            <w:tcW w:w="1440" w:type="dxa"/>
+            <w:shd w:val="clear" w:color="auto" w:fill="EAF2F8"/>
+            <w:tcMar>
+              <w:top w:w="90" w:type="dxa"/>
+              <w:left w:w="100" w:type="dxa"/>
+              <w:bottom w:w="90" w:type="dxa"/>
+              <w:right w:w="100" w:type="dxa"/>
+            </w:tcMar>
+            <w:vAlign w:val="center"/>
+          </w:tcPr>
+          <w:p>
+            <w:pPr>
+              <w:spacing w:after="0"/>
+              <w:rPr>
+                <w:lang w:val="es-US"/>
+              </w:rPr>
+            </w:pPr>
+            <w:r>
+              <w:rPr>
+                <w:sz w:val="17"/>
+                <w:lang w:val="es-US"/>
+              </w:rPr>
+              <w:t>1509</w:t>
+            </w:r>
+          </w:p>
+        </w:tc>
+        <w:tc>
+          <w:tcPr>
+            <w:tcW w:w="1368" w:type="dxa"/>
+            <w:shd w:val="clear" w:color="auto" w:fill="EAF2F8"/>
+            <w:tcMar>
+              <w:top w:w="90" w:type="dxa"/>
+              <w:left w:w="100" w:type="dxa"/>
+              <w:bottom w:w="90" w:type="dxa"/>
+              <w:right w:w="100" w:type="dxa"/>
+            </w:tcMar>
+            <w:vAlign w:val="center"/>
+          </w:tcPr>
+          <w:p>
+            <w:pPr>
+              <w:spacing w:after="0"/>
+              <w:rPr>
+                <w:lang w:val="es-US"/>
+              </w:rPr>
+            </w:pPr>
+            <w:r>
+              <w:rPr>
+                <w:sz w:val="17"/>
+                <w:lang w:val="es-US"/>
+              </w:rPr>
+              <w:t>133</w:t>
+            </w:r>
+          </w:p>
+        </w:tc>
+        <w:tc>
+          <w:tcPr>
+            <w:tcW w:w="1440" w:type="dxa"/>
+            <w:shd w:val="clear" w:color="auto" w:fill="EAF2F8"/>
+            <w:tcMar>
+              <w:top w:w="90" w:type="dxa"/>
+              <w:left w:w="100" w:type="dxa"/>
+              <w:bottom w:w="90" w:type="dxa"/>
+              <w:right w:w="100" w:type="dxa"/>
+            </w:tcMar>
+            <w:vAlign w:val="center"/>
+          </w:tcPr>
+          <w:p>
+            <w:pPr>
+              <w:spacing w:after="0"/>
+              <w:rPr>
+                <w:lang w:val="es-US"/>
+              </w:rPr>
+            </w:pPr>
+            <w:r>
+              <w:rPr>
+                <w:sz w:val="17"/>
+                <w:lang w:val="es-US"/>
+              </w:rPr>
+              <w:t>76</w:t>
+            </w:r>
+          </w:p>
+        </w:tc>
+        <w:tc>
+          <w:tcPr>
+            <w:tcW w:w="1440" w:type="dxa"/>
+            <w:shd w:val="clear" w:color="auto" w:fill="EAF2F8"/>
+            <w:tcMar>
+              <w:top w:w="90" w:type="dxa"/>
+              <w:left w:w="100" w:type="dxa"/>
+              <w:bottom w:w="90" w:type="dxa"/>
+              <w:right w:w="100" w:type="dxa"/>
+            </w:tcMar>
+            <w:vAlign w:val="center"/>
+          </w:tcPr>
+          <w:p>
+            <w:pPr>
+              <w:spacing w:after="0"/>
+              <w:rPr>
+                <w:lang w:val="es-US"/>
+              </w:rPr>
+            </w:pPr>
+            <w:r>
+              <w:rPr>
+                <w:sz w:val="17"/>
+                <w:lang w:val="es-US"/>
+              </w:rPr>
+              <w:t>57,14 %</w:t>
+            </w:r>
+          </w:p>
+        </w:tc>
+        <w:tc>
+          <w:tcPr>
+            <w:tcW w:w="1440" w:type="dxa"/>
+            <w:shd w:val="clear" w:color="auto" w:fill="EAF2F8"/>
+            <w:tcMar>
+              <w:top w:w="90" w:type="dxa"/>
+              <w:left w:w="100" w:type="dxa"/>
+              <w:bottom w:w="90" w:type="dxa"/>
+              <w:right w:w="100" w:type="dxa"/>
+            </w:tcMar>
+            <w:vAlign w:val="center"/>
+          </w:tcPr>
+          <w:p>
+            <w:pPr>
+              <w:spacing w:after="0"/>
+              <w:rPr>
+                <w:lang w:val="es-US"/>
+              </w:rPr>
+            </w:pPr>
+            <w:r>
+              <w:rPr>
+                <w:sz w:val="17"/>
+                <w:lang w:val="es-US"/>
+              </w:rPr>
+              <w:t>47,50 %</w:t>
+            </w:r>
+          </w:p>
+        </w:tc>
+      </w:tr>
+      <w:tr>
+        <w:trPr>
+          <w:jc w:val="center"/>
+        </w:trPr>
+        <w:tc>
+          <w:tcPr>
+            <w:tcW w:w="2880" w:type="dxa"/>
+            <w:tcMar>
+              <w:top w:w="90" w:type="dxa"/>
+              <w:left w:w="100" w:type="dxa"/>
+              <w:bottom w:w="90" w:type="dxa"/>
+              <w:right w:w="100" w:type="dxa"/>
+            </w:tcMar>
+            <w:vAlign w:val="center"/>
+          </w:tcPr>
+          <w:p>
+            <w:pPr>
+              <w:spacing w:after="0"/>
+              <w:rPr>
+                <w:lang w:val="es-US"/>
+              </w:rPr>
+            </w:pPr>
+            <w:r>
+              <w:rPr>
+                <w:sz w:val="17"/>
+                <w:lang w:val="es-US"/>
+              </w:rPr>
+              <w:t>Mayor o igual a 10 °C</w:t>
+            </w:r>
+          </w:p>
+        </w:tc>
+        <w:tc>
+          <w:tcPr>
+            <w:tcW w:w="1440" w:type="dxa"/>
+            <w:tcMar>
+              <w:top w:w="90" w:type="dxa"/>
+              <w:left w:w="100" w:type="dxa"/>
+              <w:bottom w:w="90" w:type="dxa"/>
+              <w:right w:w="100" w:type="dxa"/>
+            </w:tcMar>
+            <w:vAlign w:val="center"/>
+          </w:tcPr>
+          <w:p>
+            <w:pPr>
+              <w:spacing w:after="0"/>
+              <w:rPr>
+                <w:lang w:val="es-US"/>
+              </w:rPr>
+            </w:pPr>
+            <w:r>
+              <w:rPr>
+                <w:sz w:val="17"/>
+                <w:lang w:val="es-US"/>
+              </w:rPr>
+              <w:t>2890</w:t>
+            </w:r>
+          </w:p>
+        </w:tc>
+        <w:tc>
+          <w:tcPr>
+            <w:tcW w:w="1368" w:type="dxa"/>
+            <w:tcMar>
+              <w:top w:w="90" w:type="dxa"/>
+              <w:left w:w="100" w:type="dxa"/>
+              <w:bottom w:w="90" w:type="dxa"/>
+              <w:right w:w="100" w:type="dxa"/>
+            </w:tcMar>
+            <w:vAlign w:val="center"/>
+          </w:tcPr>
+          <w:p>
+            <w:pPr>
+              <w:spacing w:after="0"/>
+              <w:rPr>
+                <w:lang w:val="es-US"/>
+              </w:rPr>
+            </w:pPr>
+            <w:r>
+              <w:rPr>
+                <w:sz w:val="17"/>
+                <w:lang w:val="es-US"/>
+              </w:rPr>
+              <w:t>83</w:t>
+            </w:r>
+          </w:p>
+        </w:tc>
+        <w:tc>
+          <w:tcPr>
+            <w:tcW w:w="1440" w:type="dxa"/>
+            <w:tcMar>
+              <w:top w:w="90" w:type="dxa"/>
+              <w:left w:w="100" w:type="dxa"/>
+              <w:bottom w:w="90" w:type="dxa"/>
+              <w:right w:w="100" w:type="dxa"/>
+            </w:tcMar>
+            <w:vAlign w:val="center"/>
+          </w:tcPr>
+          <w:p>
+            <w:pPr>
+              <w:spacing w:after="0"/>
+              <w:rPr>
+                <w:lang w:val="es-US"/>
+              </w:rPr>
+            </w:pPr>
+            <w:r>
+              <w:rPr>
+                <w:sz w:val="17"/>
+                <w:lang w:val="es-US"/>
+              </w:rPr>
+              <w:t>15</w:t>
+            </w:r>
+          </w:p>
+        </w:tc>
+        <w:tc>
+          <w:tcPr>
+            <w:tcW w:w="1440" w:type="dxa"/>
+            <w:tcMar>
+              <w:top w:w="90" w:type="dxa"/>
+              <w:left w:w="100" w:type="dxa"/>
+              <w:bottom w:w="90" w:type="dxa"/>
+              <w:right w:w="100" w:type="dxa"/>
+            </w:tcMar>
+            <w:vAlign w:val="center"/>
+          </w:tcPr>
+          <w:p>
+            <w:pPr>
+              <w:spacing w:after="0"/>
+              <w:rPr>
+                <w:lang w:val="es-US"/>
+              </w:rPr>
+            </w:pPr>
+            <w:r>
+              <w:rPr>
+                <w:sz w:val="17"/>
+                <w:lang w:val="es-US"/>
+              </w:rPr>
+              <w:t>18,07 %</w:t>
+            </w:r>
+          </w:p>
+        </w:tc>
+        <w:tc>
+          <w:tcPr>
+            <w:tcW w:w="1440" w:type="dxa"/>
+            <w:tcMar>
+              <w:top w:w="90" w:type="dxa"/>
+              <w:left w:w="100" w:type="dxa"/>
+              <w:bottom w:w="90" w:type="dxa"/>
+              <w:right w:w="100" w:type="dxa"/>
+            </w:tcMar>
+            <w:vAlign w:val="center"/>
+          </w:tcPr>
+          <w:p>
+            <w:pPr>
+              <w:spacing w:after="0"/>
+              <w:rPr>
+                <w:lang w:val="es-US"/>
+              </w:rPr>
+            </w:pPr>
+            <w:r>
+              <w:rPr>
+                <w:sz w:val="17"/>
+                <w:lang w:val="es-US"/>
+              </w:rPr>
+              <w:t>30,61 %</w:t>
+            </w:r>
+          </w:p>
+        </w:tc>
+      </w:tr>
+    </w:tbl>
+    <w:p>
+      <w:pPr>
+        <w:spacing w:after="80" w:line="252" w:lineRule="auto"/>
+        <w:jc w:val="both"/>
+        <w:rPr>
+          <w:b/>
+          <w:bCs/>
+          <w:lang w:val="es-US"/>
+        </w:rPr>
+      </w:pPr>
+    </w:p>
+    <w:p>
+      <w:pPr>
+        <w:spacing w:after="80" w:line="252" w:lineRule="auto"/>
+        <w:jc w:val="both"/>
+        <w:rPr>
+          <w:lang w:val="es-US"/>
+        </w:rPr>
+      </w:pPr>
+      <w:r>
+        <w:rPr>
+          <w:b/>
+          <w:bCs/>
+          <w:lang w:val="es-US"/>
+        </w:rPr>
+        <w:t>Interpretación</w:t>
+      </w:r>
+      <w:r>
+        <w:rPr>
+          <w:b/>
+          <w:bCs/>
+          <w:lang w:val="es-US"/>
+        </w:rPr>
+        <w:t>:</w:t>
+      </w:r>
+      <w:r>
+        <w:rPr>
+          <w:lang w:val="es-US"/>
+        </w:rPr>
+        <w:t xml:space="preserve"> El modelo no funciona igual en todos los grupos. Detecta una proporción mucho menor en el grupo cercano a 20 grados Celsius. Esta auditoría utiliza </w:t>
+      </w:r>
+      <w:proofErr w:type="spellStart"/>
+      <w:r>
+        <w:rPr>
+          <w:lang w:val="es-US"/>
+        </w:rPr>
+        <w:t>producto_id</w:t>
+      </w:r>
+      <w:proofErr w:type="spellEnd"/>
+      <w:r>
+        <w:rPr>
+          <w:lang w:val="es-US"/>
+        </w:rPr>
+        <w:t xml:space="preserve"> solo para separar los resultados; el modelo oficial mantiene las cinco variables exigidas y no utiliza el producto como predictor.</w:t>
+      </w:r>
+    </w:p>
+    <w:p>
+      <w:pPr>
+        <w:spacing w:after="80" w:line="252" w:lineRule="auto"/>
+        <w:rPr>
+          <w:lang w:val="es-US"/>
+        </w:rPr>
+      </w:pPr>
+      <w:r>
+        <w:rPr>
+          <w:lang w:val="es-US"/>
+        </w:rPr>
+        <w:br w:type="page"/>
+      </w:r>
+    </w:p>
+    <w:p>
+      <w:pPr>
+        <w:pStyle w:val="Heading1"/>
+        <w:rPr>
+          <w:lang w:val="es-US"/>
+        </w:rPr>
+      </w:pPr>
+      <w:r>
+        <w:rPr>
+          <w:lang w:val="es-US"/>
+        </w:rPr>
+        <w:lastRenderedPageBreak/>
+        <w:t>E</w:t>
+      </w:r>
+      <w:r>
+        <w:rPr>
+          <w:lang w:val="es-US"/>
+        </w:rPr>
+        <w:t xml:space="preserve">. </w:t>
+      </w:r>
+      <w:r>
+        <w:rPr>
+          <w:lang w:val="es-US"/>
+        </w:rPr>
+        <w:t>Interpretación y decisión</w:t>
+      </w:r>
+    </w:p>
+    <w:p>
+      <w:pPr>
+        <w:spacing w:after="80" w:line="252" w:lineRule="auto"/>
+        <w:jc w:val="both"/>
+        <w:rPr>
+          <w:lang w:val="es-US"/>
+        </w:rPr>
+      </w:pPr>
+      <w:r>
+        <w:rPr>
+          <w:b/>
+          <w:bCs/>
+          <w:lang w:val="es-US"/>
+        </w:rPr>
+        <w:t>Hallazgo principal</w:t>
+      </w:r>
+      <w:r>
+        <w:rPr>
+          <w:b/>
+          <w:bCs/>
+          <w:lang w:val="es-US"/>
+        </w:rPr>
+        <w:t>:</w:t>
+      </w:r>
+      <w:r>
+        <w:rPr>
+          <w:lang w:val="es-US"/>
+        </w:rPr>
+        <w:t xml:space="preserve"> El modelo reconoce principalmente la continuidad de una desviación ya existente y tiene dificultades para anticipar un evento nuevo cuando la lectura actual todavía es normal. Además, su desempeño cambia según el grupo térmico del producto y baja a 18,07</w:t>
+      </w:r>
+      <w:r>
+        <w:rPr>
+          <w:lang w:val="es-US"/>
+        </w:rPr>
+        <w:t>%</w:t>
+      </w:r>
+      <w:r>
+        <w:rPr>
+          <w:lang w:val="es-US"/>
+        </w:rPr>
+        <w:t xml:space="preserve"> de </w:t>
+      </w:r>
+      <w:proofErr w:type="spellStart"/>
+      <w:r>
+        <w:rPr>
+          <w:lang w:val="es-US"/>
+        </w:rPr>
+        <w:t>recall</w:t>
+      </w:r>
+      <w:proofErr w:type="spellEnd"/>
+      <w:r>
+        <w:rPr>
+          <w:lang w:val="es-US"/>
+        </w:rPr>
+        <w:t xml:space="preserve"> en el grupo cercano a 20 grados Celsius. La alerta no debe interpretarse como causa ni como decisión automática. La recomendación es realizar una validación operativa supervisada, separada por producto y estado térmico actual.</w:t>
+      </w:r>
+    </w:p>
+    <w:tbl>
+      <w:tblPr>
+        <w:tblW w:w="10100" w:type="dxa"/>
+        <w:jc w:val="center"/>
+        <w:tblBorders>
+          <w:top w:val="single" w:sz="8" w:space="0" w:color="D9D9D9"/>
+          <w:left w:val="single" w:sz="8" w:space="0" w:color="D9D9D9"/>
+          <w:bottom w:val="single" w:sz="8" w:space="0" w:color="D9D9D9"/>
+          <w:right w:val="single" w:sz="8" w:space="0" w:color="D9D9D9"/>
+          <w:insideH w:val="single" w:sz="8" w:space="0" w:color="D9D9D9"/>
+          <w:insideV w:val="single" w:sz="8" w:space="0" w:color="D9D9D9"/>
+        </w:tblBorders>
+        <w:tblLayout w:type="fixed"/>
+        <w:tblLook w:val="04A0" w:firstRow="1" w:lastRow="0" w:firstColumn="1" w:lastColumn="0" w:noHBand="0" w:noVBand="1"/>
+      </w:tblPr>
+      <w:tblGrid>
         <w:gridCol w:w="1080"/>
         <w:gridCol w:w="3600"/>
         <w:gridCol w:w="3240"/>
-        <w:gridCol w:w="2592"/>
+        <w:gridCol w:w="2180"/>
       </w:tblGrid>
       <w:tr>
         <w:trPr>
@@ -2816,8 +4989,6 @@
             <w:pPr>
               <w:spacing w:after="0"/>
               <w:rPr>
-                <w:sz w:val="18"/>
-                <w:szCs w:val="18"/>
                 <w:lang w:val="es-US"/>
               </w:rPr>
             </w:pPr>
@@ -2825,8 +4996,7 @@
               <w:rPr>
                 <w:b/>
                 <w:color w:val="FFFFFF"/>
-                <w:sz w:val="18"/>
-                <w:szCs w:val="18"/>
+                <w:sz w:val="17"/>
                 <w:lang w:val="es-US"/>
               </w:rPr>
               <w:t>Prioridad</w:t>
@@ -2849,8 +5019,6 @@
             <w:pPr>
               <w:spacing w:after="0"/>
               <w:rPr>
-                <w:sz w:val="18"/>
-                <w:szCs w:val="18"/>
                 <w:lang w:val="es-US"/>
               </w:rPr>
             </w:pPr>
@@ -2858,8 +5026,7 @@
               <w:rPr>
                 <w:b/>
                 <w:color w:val="FFFFFF"/>
-                <w:sz w:val="18"/>
-                <w:szCs w:val="18"/>
+                <w:sz w:val="17"/>
                 <w:lang w:val="es-US"/>
               </w:rPr>
               <w:t>Recomendación</w:t>
@@ -2882,8 +5049,6 @@
             <w:pPr>
               <w:spacing w:after="0"/>
               <w:rPr>
-                <w:sz w:val="18"/>
-                <w:szCs w:val="18"/>
                 <w:lang w:val="es-US"/>
               </w:rPr>
             </w:pPr>
@@ -2891,8 +5056,7 @@
               <w:rPr>
                 <w:b/>
                 <w:color w:val="FFFFFF"/>
-                <w:sz w:val="18"/>
-                <w:szCs w:val="18"/>
+                <w:sz w:val="17"/>
                 <w:lang w:val="es-US"/>
               </w:rPr>
               <w:t>Evidencia</w:t>
@@ -2901,7 +5065,7 @@
         </w:tc>
         <w:tc>
           <w:tcPr>
-            <w:tcW w:w="2592" w:type="dxa"/>
+            <w:tcW w:w="2180" w:type="dxa"/>
             <w:shd w:val="clear" w:color="auto" w:fill="1F4E78"/>
             <w:tcMar>
               <w:top w:w="90" w:type="dxa"/>
@@ -2915,8 +5079,6 @@
             <w:pPr>
               <w:spacing w:after="0"/>
               <w:rPr>
-                <w:sz w:val="18"/>
-                <w:szCs w:val="18"/>
                 <w:lang w:val="es-US"/>
               </w:rPr>
             </w:pPr>
@@ -2924,8 +5086,7 @@
               <w:rPr>
                 <w:b/>
                 <w:color w:val="FFFFFF"/>
-                <w:sz w:val="18"/>
-                <w:szCs w:val="18"/>
+                <w:sz w:val="17"/>
                 <w:lang w:val="es-US"/>
               </w:rPr>
               <w:t>Decisión o responsable</w:t>
@@ -2952,15 +5113,12 @@
             <w:pPr>
               <w:spacing w:after="0"/>
               <w:rPr>
-                <w:sz w:val="18"/>
-                <w:szCs w:val="18"/>
                 <w:lang w:val="es-US"/>
               </w:rPr>
             </w:pPr>
             <w:r>
               <w:rPr>
-                <w:sz w:val="18"/>
-                <w:szCs w:val="18"/>
+                <w:sz w:val="17"/>
                 <w:lang w:val="es-US"/>
               </w:rPr>
               <w:t>Alta</w:t>
@@ -2982,15 +5140,12 @@
             <w:pPr>
               <w:spacing w:after="0"/>
               <w:rPr>
-                <w:sz w:val="18"/>
-                <w:szCs w:val="18"/>
                 <w:lang w:val="es-US"/>
               </w:rPr>
             </w:pPr>
             <w:r>
               <w:rPr>
-                <w:sz w:val="18"/>
-                <w:szCs w:val="18"/>
+                <w:sz w:val="17"/>
                 <w:lang w:val="es-US"/>
               </w:rPr>
               <w:t>Usar el riesgo para priorizar revisión humana</w:t>
@@ -3012,15 +5167,12 @@
             <w:pPr>
               <w:spacing w:after="0"/>
               <w:rPr>
-                <w:sz w:val="18"/>
-                <w:szCs w:val="18"/>
                 <w:lang w:val="es-US"/>
               </w:rPr>
             </w:pPr>
             <w:r>
               <w:rPr>
-                <w:sz w:val="18"/>
-                <w:szCs w:val="18"/>
+                <w:sz w:val="17"/>
                 <w:lang w:val="es-US"/>
               </w:rPr>
               <w:t>130 eventos detectados y 148 omitidos</w:t>
@@ -3029,7 +5181,7 @@
         </w:tc>
         <w:tc>
           <w:tcPr>
-            <w:tcW w:w="2592" w:type="dxa"/>
+            <w:tcW w:w="2180" w:type="dxa"/>
             <w:tcMar>
               <w:top w:w="90" w:type="dxa"/>
               <w:left w:w="100" w:type="dxa"/>
@@ -3042,15 +5194,12 @@
             <w:pPr>
               <w:spacing w:after="0"/>
               <w:rPr>
-                <w:sz w:val="18"/>
-                <w:szCs w:val="18"/>
                 <w:lang w:val="es-US"/>
               </w:rPr>
             </w:pPr>
             <w:r>
               <w:rPr>
-                <w:sz w:val="18"/>
-                <w:szCs w:val="18"/>
+                <w:sz w:val="17"/>
                 <w:lang w:val="es-US"/>
               </w:rPr>
               <w:t>Monitoreo de cadena de frío</w:t>
@@ -3078,15 +5227,12 @@
             <w:pPr>
               <w:spacing w:after="0"/>
               <w:rPr>
-                <w:sz w:val="18"/>
-                <w:szCs w:val="18"/>
                 <w:lang w:val="es-US"/>
               </w:rPr>
             </w:pPr>
             <w:r>
               <w:rPr>
-                <w:sz w:val="18"/>
-                <w:szCs w:val="18"/>
+                <w:sz w:val="17"/>
                 <w:lang w:val="es-US"/>
               </w:rPr>
               <w:t>Alta</w:t>
@@ -3109,15 +5255,12 @@
             <w:pPr>
               <w:spacing w:after="0"/>
               <w:rPr>
-                <w:sz w:val="18"/>
-                <w:szCs w:val="18"/>
                 <w:lang w:val="es-US"/>
               </w:rPr>
             </w:pPr>
             <w:r>
               <w:rPr>
-                <w:sz w:val="18"/>
-                <w:szCs w:val="18"/>
+                <w:sz w:val="17"/>
                 <w:lang w:val="es-US"/>
               </w:rPr>
               <w:t>Definir el costo de omitir y de alertar</w:t>
@@ -3140,15 +5283,12 @@
             <w:pPr>
               <w:spacing w:after="0"/>
               <w:rPr>
-                <w:sz w:val="18"/>
-                <w:szCs w:val="18"/>
                 <w:lang w:val="es-US"/>
               </w:rPr>
             </w:pPr>
             <w:r>
               <w:rPr>
-                <w:sz w:val="18"/>
-                <w:szCs w:val="18"/>
+                <w:sz w:val="17"/>
                 <w:lang w:val="es-US"/>
               </w:rPr>
               <w:t>148 falsos negativos y 331 falsos positivos</w:t>
@@ -3157,7 +5297,7 @@
         </w:tc>
         <w:tc>
           <w:tcPr>
-            <w:tcW w:w="2592" w:type="dxa"/>
+            <w:tcW w:w="2180" w:type="dxa"/>
             <w:shd w:val="clear" w:color="auto" w:fill="EAF2F8"/>
             <w:tcMar>
               <w:top w:w="90" w:type="dxa"/>
@@ -3171,15 +5311,12 @@
             <w:pPr>
               <w:spacing w:after="0"/>
               <w:rPr>
-                <w:sz w:val="18"/>
-                <w:szCs w:val="18"/>
                 <w:lang w:val="es-US"/>
               </w:rPr>
             </w:pPr>
             <w:r>
               <w:rPr>
-                <w:sz w:val="18"/>
-                <w:szCs w:val="18"/>
+                <w:sz w:val="17"/>
                 <w:lang w:val="es-US"/>
               </w:rPr>
               <w:t>Operaciones y calidad</w:t>
@@ -3206,15 +5343,281 @@
             <w:pPr>
               <w:spacing w:after="0"/>
               <w:rPr>
-                <w:sz w:val="18"/>
-                <w:szCs w:val="18"/>
                 <w:lang w:val="es-US"/>
               </w:rPr>
             </w:pPr>
             <w:r>
               <w:rPr>
-                <w:sz w:val="18"/>
-                <w:szCs w:val="18"/>
+                <w:sz w:val="17"/>
+                <w:lang w:val="es-US"/>
+              </w:rPr>
+              <w:t>Alta</w:t>
+            </w:r>
+          </w:p>
+        </w:tc>
+        <w:tc>
+          <w:tcPr>
+            <w:tcW w:w="3600" w:type="dxa"/>
+            <w:tcMar>
+              <w:top w:w="90" w:type="dxa"/>
+              <w:left w:w="100" w:type="dxa"/>
+              <w:bottom w:w="90" w:type="dxa"/>
+              <w:right w:w="100" w:type="dxa"/>
+            </w:tcMar>
+            <w:vAlign w:val="center"/>
+          </w:tcPr>
+          <w:p>
+            <w:pPr>
+              <w:spacing w:after="0"/>
+              <w:rPr>
+                <w:lang w:val="es-US"/>
+              </w:rPr>
+            </w:pPr>
+            <w:r>
+              <w:rPr>
+                <w:sz w:val="17"/>
+                <w:lang w:val="es-US"/>
+              </w:rPr>
+              <w:t>Evaluar por separado eventos que parten de estado normal</w:t>
+            </w:r>
+          </w:p>
+        </w:tc>
+        <w:tc>
+          <w:tcPr>
+            <w:tcW w:w="3240" w:type="dxa"/>
+            <w:tcMar>
+              <w:top w:w="90" w:type="dxa"/>
+              <w:left w:w="100" w:type="dxa"/>
+              <w:bottom w:w="90" w:type="dxa"/>
+              <w:right w:w="100" w:type="dxa"/>
+            </w:tcMar>
+            <w:vAlign w:val="center"/>
+          </w:tcPr>
+          <w:p>
+            <w:pPr>
+              <w:spacing w:after="0"/>
+              <w:rPr>
+                <w:lang w:val="es-US"/>
+              </w:rPr>
+            </w:pPr>
+            <w:proofErr w:type="spellStart"/>
+            <w:r>
+              <w:rPr>
+                <w:sz w:val="17"/>
+                <w:lang w:val="es-US"/>
+              </w:rPr>
+              <w:t>Recall</w:t>
+            </w:r>
+            <w:proofErr w:type="spellEnd"/>
+            <w:r>
+              <w:rPr>
+                <w:sz w:val="17"/>
+                <w:lang w:val="es-US"/>
+              </w:rPr>
+              <w:t xml:space="preserve"> de 6,33</w:t>
+            </w:r>
+            <w:r>
+              <w:rPr>
+                <w:sz w:val="17"/>
+                <w:lang w:val="es-US"/>
+              </w:rPr>
+              <w:t>%</w:t>
+            </w:r>
+          </w:p>
+        </w:tc>
+        <w:tc>
+          <w:tcPr>
+            <w:tcW w:w="2180" w:type="dxa"/>
+            <w:tcMar>
+              <w:top w:w="90" w:type="dxa"/>
+              <w:left w:w="100" w:type="dxa"/>
+              <w:bottom w:w="90" w:type="dxa"/>
+              <w:right w:w="100" w:type="dxa"/>
+            </w:tcMar>
+            <w:vAlign w:val="center"/>
+          </w:tcPr>
+          <w:p>
+            <w:pPr>
+              <w:spacing w:after="0"/>
+              <w:rPr>
+                <w:lang w:val="es-US"/>
+              </w:rPr>
+            </w:pPr>
+            <w:r>
+              <w:rPr>
+                <w:sz w:val="17"/>
+                <w:lang w:val="es-US"/>
+              </w:rPr>
+              <w:t>Equipo analítico</w:t>
+            </w:r>
+          </w:p>
+        </w:tc>
+      </w:tr>
+      <w:tr>
+        <w:trPr>
+          <w:jc w:val="center"/>
+        </w:trPr>
+        <w:tc>
+          <w:tcPr>
+            <w:tcW w:w="1080" w:type="dxa"/>
+            <w:shd w:val="clear" w:color="auto" w:fill="EAF2F8"/>
+            <w:tcMar>
+              <w:top w:w="90" w:type="dxa"/>
+              <w:left w:w="100" w:type="dxa"/>
+              <w:bottom w:w="90" w:type="dxa"/>
+              <w:right w:w="100" w:type="dxa"/>
+            </w:tcMar>
+            <w:vAlign w:val="center"/>
+          </w:tcPr>
+          <w:p>
+            <w:pPr>
+              <w:spacing w:after="0"/>
+              <w:rPr>
+                <w:lang w:val="es-US"/>
+              </w:rPr>
+            </w:pPr>
+            <w:r>
+              <w:rPr>
+                <w:sz w:val="17"/>
+                <w:lang w:val="es-US"/>
+              </w:rPr>
+              <w:t>Alta</w:t>
+            </w:r>
+          </w:p>
+        </w:tc>
+        <w:tc>
+          <w:tcPr>
+            <w:tcW w:w="3600" w:type="dxa"/>
+            <w:shd w:val="clear" w:color="auto" w:fill="EAF2F8"/>
+            <w:tcMar>
+              <w:top w:w="90" w:type="dxa"/>
+              <w:left w:w="100" w:type="dxa"/>
+              <w:bottom w:w="90" w:type="dxa"/>
+              <w:right w:w="100" w:type="dxa"/>
+            </w:tcMar>
+            <w:vAlign w:val="center"/>
+          </w:tcPr>
+          <w:p>
+            <w:pPr>
+              <w:spacing w:after="0"/>
+              <w:rPr>
+                <w:lang w:val="es-US"/>
+              </w:rPr>
+            </w:pPr>
+            <w:r>
+              <w:rPr>
+                <w:sz w:val="17"/>
+                <w:lang w:val="es-US"/>
+              </w:rPr>
+              <w:t>Validar por producto y grupo térmico</w:t>
+            </w:r>
+          </w:p>
+        </w:tc>
+        <w:tc>
+          <w:tcPr>
+            <w:tcW w:w="3240" w:type="dxa"/>
+            <w:shd w:val="clear" w:color="auto" w:fill="EAF2F8"/>
+            <w:tcMar>
+              <w:top w:w="90" w:type="dxa"/>
+              <w:left w:w="100" w:type="dxa"/>
+              <w:bottom w:w="90" w:type="dxa"/>
+              <w:right w:w="100" w:type="dxa"/>
+            </w:tcMar>
+            <w:vAlign w:val="center"/>
+          </w:tcPr>
+          <w:p>
+            <w:pPr>
+              <w:spacing w:after="0"/>
+              <w:rPr>
+                <w:lang w:val="es-US"/>
+              </w:rPr>
+            </w:pPr>
+            <w:proofErr w:type="spellStart"/>
+            <w:r>
+              <w:rPr>
+                <w:sz w:val="17"/>
+                <w:lang w:val="es-US"/>
+              </w:rPr>
+              <w:t>Recall</w:t>
+            </w:r>
+            <w:proofErr w:type="spellEnd"/>
+            <w:r>
+              <w:rPr>
+                <w:sz w:val="17"/>
+                <w:lang w:val="es-US"/>
+              </w:rPr>
+              <w:t xml:space="preserve"> de 18,07</w:t>
+            </w:r>
+            <w:r>
+              <w:rPr>
+                <w:sz w:val="17"/>
+                <w:lang w:val="es-US"/>
+              </w:rPr>
+              <w:t>%</w:t>
+            </w:r>
+            <w:r>
+              <w:rPr>
+                <w:sz w:val="17"/>
+                <w:lang w:val="es-US"/>
+              </w:rPr>
+              <w:t xml:space="preserve"> en el grupo cercano a 20 grados</w:t>
+            </w:r>
+          </w:p>
+        </w:tc>
+        <w:tc>
+          <w:tcPr>
+            <w:tcW w:w="2180" w:type="dxa"/>
+            <w:shd w:val="clear" w:color="auto" w:fill="EAF2F8"/>
+            <w:tcMar>
+              <w:top w:w="90" w:type="dxa"/>
+              <w:left w:w="100" w:type="dxa"/>
+              <w:bottom w:w="90" w:type="dxa"/>
+              <w:right w:w="100" w:type="dxa"/>
+            </w:tcMar>
+            <w:vAlign w:val="center"/>
+          </w:tcPr>
+          <w:p>
+            <w:pPr>
+              <w:spacing w:after="0"/>
+              <w:rPr>
+                <w:lang w:val="es-US"/>
+              </w:rPr>
+            </w:pPr>
+            <w:r>
+              <w:rPr>
+                <w:sz w:val="17"/>
+                <w:lang w:val="es-US"/>
+              </w:rPr>
+              <w:t>Operaciones y calidad</w:t>
+            </w:r>
+          </w:p>
+        </w:tc>
+      </w:tr>
+      <w:tr>
+        <w:trPr>
+          <w:jc w:val="center"/>
+        </w:trPr>
+        <w:tc>
+          <w:tcPr>
+            <w:tcW w:w="1080" w:type="dxa"/>
+            <w:tcMar>
+              <w:top w:w="90" w:type="dxa"/>
+              <w:left w:w="100" w:type="dxa"/>
+              <w:bottom w:w="90" w:type="dxa"/>
+              <w:right w:w="100" w:type="dxa"/>
+            </w:tcMar>
+            <w:vAlign w:val="center"/>
+          </w:tcPr>
+          <w:p>
+            <w:pPr>
+              <w:spacing w:after="0"/>
+              <w:rPr>
+                <w:lang w:val="es-US"/>
+              </w:rPr>
+            </w:pPr>
+            <w:r>
+              <w:rPr>
+                <w:sz w:val="17"/>
                 <w:lang w:val="es-US"/>
               </w:rPr>
               <w:t>Media</w:t>
@@ -3236,15 +5639,12 @@
             <w:pPr>
               <w:spacing w:after="0"/>
               <w:rPr>
-                <w:sz w:val="18"/>
-                <w:szCs w:val="18"/>
                 <w:lang w:val="es-US"/>
               </w:rPr>
             </w:pPr>
             <w:r>
               <w:rPr>
-                <w:sz w:val="18"/>
-                <w:szCs w:val="18"/>
+                <w:sz w:val="17"/>
                 <w:lang w:val="es-US"/>
               </w:rPr>
               <w:t>Ajustar el umbral solo con validación separada</w:t>
@@ -3266,15 +5666,12 @@
             <w:pPr>
               <w:spacing w:after="0"/>
               <w:rPr>
-                <w:sz w:val="18"/>
-                <w:szCs w:val="18"/>
                 <w:lang w:val="es-US"/>
               </w:rPr>
             </w:pPr>
             <w:r>
               <w:rPr>
-                <w:sz w:val="18"/>
-                <w:szCs w:val="18"/>
+                <w:sz w:val="17"/>
                 <w:lang w:val="es-US"/>
               </w:rPr>
               <w:t>Umbral 0,50 no fue optimizado con prueba</w:t>
@@ -3283,7 +5680,7 @@
         </w:tc>
         <w:tc>
           <w:tcPr>
-            <w:tcW w:w="2592" w:type="dxa"/>
+            <w:tcW w:w="2180" w:type="dxa"/>
             <w:tcMar>
               <w:top w:w="90" w:type="dxa"/>
               <w:left w:w="100" w:type="dxa"/>
@@ -3296,15 +5693,12 @@
             <w:pPr>
               <w:spacing w:after="0"/>
               <w:rPr>
-                <w:sz w:val="18"/>
-                <w:szCs w:val="18"/>
                 <w:lang w:val="es-US"/>
               </w:rPr>
             </w:pPr>
             <w:r>
               <w:rPr>
-                <w:sz w:val="18"/>
-                <w:szCs w:val="18"/>
+                <w:sz w:val="17"/>
                 <w:lang w:val="es-US"/>
               </w:rPr>
               <w:t>Equipo analítico</w:t>
@@ -3379,7 +5773,7 @@
         <w:rPr>
           <w:lang w:val="es-US"/>
         </w:rPr>
-        <w:t>, la evaluación corresponde a una sola división temporal por grupos y la fuente no incluye todas las causas operativas posibles. Los coeficientes no prueban causalidad. El modelo no debe activar sanciones ni decisiones automáticas; requiere revisión humana, seguimiento de falsas alertas, control de deriva y autorización para cualquier uso operativo. Los datos utilizados contienen identificadores operativos, no nombres personales.</w:t>
+        <w:t>, la evaluación corresponde a una sola división temporal por grupos y la fuente no incluye todas las causas operativas posibles. No se proporcionaron rangos térmicos oficiales por producto y algunos productos tienen pocos eventos positivos en prueba. Los coeficientes no prueban causalidad. El modelo no debe activar sanciones ni decisiones automáticas; requiere revisión humana, seguimiento de falsas alertas, control de deriva y autorización para cualquier uso operativo. Los datos utilizados contienen identificadores operativos, no nombres personales.</w:t>
       </w:r>
     </w:p>
     <w:p>
@@ -3438,7 +5832,7 @@
         <w:rPr>
           <w:lang w:val="es-US"/>
         </w:rPr>
-        <w:t>, precisión y PR AUC. Debe permitir seguimiento por periodo sin mostrar datos personales.</w:t>
+        <w:t>, precisión y PR AUC. También debe permitir filtros por producto, grupo térmico observado y presencia de desviación actual. Debe permitir seguimiento por periodo sin mostrar datos personales.</w:t>
       </w:r>
     </w:p>
     <w:p>
@@ -3474,7 +5868,7 @@
         <w:gridCol w:w="1728"/>
         <w:gridCol w:w="2376"/>
         <w:gridCol w:w="3024"/>
-        <w:gridCol w:w="3384"/>
+        <w:gridCol w:w="2688"/>
       </w:tblGrid>
       <w:tr>
         <w:trPr>
@@ -3497,8 +5891,6 @@
             <w:pPr>
               <w:spacing w:after="0"/>
               <w:rPr>
-                <w:sz w:val="18"/>
-                <w:szCs w:val="18"/>
                 <w:lang w:val="es-US"/>
               </w:rPr>
             </w:pPr>
@@ -3506,8 +5898,7 @@
               <w:rPr>
                 <w:b/>
                 <w:color w:val="FFFFFF"/>
-                <w:sz w:val="18"/>
-                <w:szCs w:val="18"/>
+                <w:sz w:val="17"/>
                 <w:lang w:val="es-US"/>
               </w:rPr>
               <w:t>Herramienta</w:t>
@@ -3530,8 +5921,6 @@
             <w:pPr>
               <w:spacing w:after="0"/>
               <w:rPr>
-                <w:sz w:val="18"/>
-                <w:szCs w:val="18"/>
                 <w:lang w:val="es-US"/>
               </w:rPr>
             </w:pPr>
@@ -3539,8 +5928,7 @@
               <w:rPr>
                 <w:b/>
                 <w:color w:val="FFFFFF"/>
-                <w:sz w:val="18"/>
-                <w:szCs w:val="18"/>
+                <w:sz w:val="17"/>
                 <w:lang w:val="es-US"/>
               </w:rPr>
               <w:t>Propósito</w:t>
@@ -3563,8 +5951,6 @@
             <w:pPr>
               <w:spacing w:after="0"/>
               <w:rPr>
-                <w:sz w:val="18"/>
-                <w:szCs w:val="18"/>
                 <w:lang w:val="es-US"/>
               </w:rPr>
             </w:pPr>
@@ -3572,8 +5958,7 @@
               <w:rPr>
                 <w:b/>
                 <w:color w:val="FFFFFF"/>
-                <w:sz w:val="18"/>
-                <w:szCs w:val="18"/>
+                <w:sz w:val="17"/>
                 <w:lang w:val="es-US"/>
               </w:rPr>
               <w:t>Contenido asistido</w:t>
@@ -3582,7 +5967,7 @@
         </w:tc>
         <w:tc>
           <w:tcPr>
-            <w:tcW w:w="3384" w:type="dxa"/>
+            <w:tcW w:w="2688" w:type="dxa"/>
             <w:shd w:val="clear" w:color="auto" w:fill="1F4E78"/>
             <w:tcMar>
               <w:top w:w="90" w:type="dxa"/>
@@ -3596,8 +5981,6 @@
             <w:pPr>
               <w:spacing w:after="0"/>
               <w:rPr>
-                <w:sz w:val="18"/>
-                <w:szCs w:val="18"/>
                 <w:lang w:val="es-US"/>
               </w:rPr>
             </w:pPr>
@@ -3605,8 +5988,7 @@
               <w:rPr>
                 <w:b/>
                 <w:color w:val="FFFFFF"/>
-                <w:sz w:val="18"/>
-                <w:szCs w:val="18"/>
+                <w:sz w:val="17"/>
                 <w:lang w:val="es-US"/>
               </w:rPr>
               <w:t>Verificación humana</w:t>
@@ -3633,16 +6015,13 @@
             <w:pPr>
               <w:spacing w:after="0"/>
               <w:rPr>
-                <w:sz w:val="18"/>
-                <w:szCs w:val="18"/>
                 <w:lang w:val="es-US"/>
               </w:rPr>
             </w:pPr>
             <w:proofErr w:type="spellStart"/>
             <w:r>
               <w:rPr>
-                <w:sz w:val="18"/>
-                <w:szCs w:val="18"/>
+                <w:sz w:val="17"/>
                 <w:lang w:val="es-US"/>
               </w:rPr>
               <w:t>OpenAI</w:t>
@@ -3650,8 +6029,7 @@
             <w:proofErr w:type="spellEnd"/>
             <w:r>
               <w:rPr>
-                <w:sz w:val="18"/>
-                <w:szCs w:val="18"/>
+                <w:sz w:val="17"/>
                 <w:lang w:val="es-US"/>
               </w:rPr>
               <w:t xml:space="preserve"> Codex</w:t>
@@ -3673,18 +6051,15 @@
             <w:pPr>
               <w:spacing w:after="0"/>
               <w:rPr>
-                <w:sz w:val="18"/>
-                <w:szCs w:val="18"/>
                 <w:lang w:val="es-US"/>
               </w:rPr>
             </w:pPr>
             <w:r>
               <w:rPr>
-                <w:sz w:val="18"/>
-                <w:szCs w:val="18"/>
-                <w:lang w:val="es-US"/>
-              </w:rPr>
-              <w:t>Apoyo en código</w:t>
+                <w:sz w:val="17"/>
+                <w:lang w:val="es-US"/>
+              </w:rPr>
+              <w:t>Apoyo en código y redacción</w:t>
             </w:r>
           </w:p>
         </w:tc>
@@ -3703,15 +6078,12 @@
             <w:pPr>
               <w:spacing w:after="0"/>
               <w:rPr>
-                <w:sz w:val="18"/>
-                <w:szCs w:val="18"/>
                 <w:lang w:val="es-US"/>
               </w:rPr>
             </w:pPr>
             <w:r>
               <w:rPr>
-                <w:sz w:val="18"/>
-                <w:szCs w:val="18"/>
+                <w:sz w:val="17"/>
                 <w:lang w:val="es-US"/>
               </w:rPr>
               <w:t>Notebooks informe y controles</w:t>
@@ -3720,7 +6092,7 @@
         </w:tc>
         <w:tc>
           <w:tcPr>
-            <w:tcW w:w="3384" w:type="dxa"/>
+            <w:tcW w:w="2688" w:type="dxa"/>
             <w:tcMar>
               <w:top w:w="90" w:type="dxa"/>
               <w:left w:w="100" w:type="dxa"/>
@@ -3733,15 +6105,12 @@
             <w:pPr>
               <w:spacing w:after="0"/>
               <w:rPr>
-                <w:sz w:val="18"/>
-                <w:szCs w:val="18"/>
                 <w:lang w:val="es-US"/>
               </w:rPr>
             </w:pPr>
             <w:r>
               <w:rPr>
-                <w:sz w:val="18"/>
-                <w:szCs w:val="18"/>
+                <w:sz w:val="17"/>
                 <w:lang w:val="es-US"/>
               </w:rPr>
               <w:t>El equipo debe cotejar cifras y aprobar la versión final</w:t>
@@ -3892,7 +6261,6 @@
       </w:pPr>
       <w:r>
         <w:rPr>
-          <w:rFonts w:ascii="Segoe UI Symbol" w:hAnsi="Segoe UI Symbol" w:cs="Segoe UI Symbol"/>
           <w:lang w:val="es-US"/>
         </w:rPr>
         <w:t>☒</w:t>
@@ -3905,7 +6273,7 @@
       </w:r>
     </w:p>
     <w:sectPr>
-      <w:footerReference w:type="default" r:id="rId11"/>
+      <w:footerReference w:type="default" r:id="rId12"/>
       <w:pgSz w:w="11906" w:h="16838"/>
       <w:pgMar w:top="935" w:right="964" w:bottom="879" w:left="964" w:header="720" w:footer="720" w:gutter="0"/>
       <w:cols w:space="720"/>
@@ -4338,31 +6706,31 @@
       </w:rPr>
     </w:lvl>
   </w:abstractNum>
-  <w:num w:numId="1" w16cid:durableId="1696540654">
+  <w:num w:numId="1" w16cid:durableId="990988974">
     <w:abstractNumId w:val="8"/>
   </w:num>
-  <w:num w:numId="2" w16cid:durableId="297994760">
+  <w:num w:numId="2" w16cid:durableId="2012294701">
     <w:abstractNumId w:val="6"/>
   </w:num>
-  <w:num w:numId="3" w16cid:durableId="84767718">
+  <w:num w:numId="3" w16cid:durableId="1590429750">
     <w:abstractNumId w:val="5"/>
   </w:num>
-  <w:num w:numId="4" w16cid:durableId="559053996">
+  <w:num w:numId="4" w16cid:durableId="115485711">
     <w:abstractNumId w:val="4"/>
   </w:num>
-  <w:num w:numId="5" w16cid:durableId="1232157788">
+  <w:num w:numId="5" w16cid:durableId="347145268">
     <w:abstractNumId w:val="7"/>
   </w:num>
-  <w:num w:numId="6" w16cid:durableId="181750417">
+  <w:num w:numId="6" w16cid:durableId="972560001">
     <w:abstractNumId w:val="3"/>
   </w:num>
-  <w:num w:numId="7" w16cid:durableId="310864664">
+  <w:num w:numId="7" w16cid:durableId="964308733">
     <w:abstractNumId w:val="2"/>
   </w:num>
-  <w:num w:numId="8" w16cid:durableId="318773000">
+  <w:num w:numId="8" w16cid:durableId="1137642750">
     <w:abstractNumId w:val="1"/>
   </w:num>
-  <w:num w:numId="9" w16cid:durableId="2080204201">
+  <w:num w:numId="9" w16cid:durableId="222719937">
     <w:abstractNumId w:val="0"/>
   </w:num>
 </w:numbering>

</xml_diff>